<commit_message>
Week 1: updated literature matrix, read through Fink 2020 paper again and read and summarised and annotated Deckers, 2022
</commit_message>
<xml_diff>
--- a/Literature_Matrix.docx
+++ b/Literature_Matrix.docx
@@ -9,12 +9,12 @@
         <w:tblLook w:val="04A0" w:firstRow="1" w:lastRow="0" w:firstColumn="1" w:lastColumn="0" w:noHBand="0" w:noVBand="1"/>
       </w:tblPr>
       <w:tblGrid>
-        <w:gridCol w:w="1378"/>
-        <w:gridCol w:w="1456"/>
+        <w:gridCol w:w="1005"/>
+        <w:gridCol w:w="1557"/>
         <w:gridCol w:w="1534"/>
-        <w:gridCol w:w="1482"/>
+        <w:gridCol w:w="1676"/>
         <w:gridCol w:w="1670"/>
-        <w:gridCol w:w="1496"/>
+        <w:gridCol w:w="1574"/>
       </w:tblGrid>
       <w:tr>
         <w:tc>
@@ -316,6 +316,151 @@
           <w:p>
             <w:r>
               <w:t>I will use this broker to access LSST data to find the correlation between the supernova position and the properties of the host galaxy. It is important that I understand some of the technical side and it help contextualise the main tool of my project.</w:t>
+            </w:r>
+          </w:p>
+        </w:tc>
+      </w:tr>
+      <w:tr>
+        <w:tc>
+          <w:tcPr>
+            <w:tcW w:w="1378" w:type="dxa"/>
+          </w:tcPr>
+          <w:p>
+            <w:pPr>
+              <w:rPr>
+                <w:rFonts w:ascii="Aptos Narrow" w:hAnsi="Aptos Narrow"/>
+                <w:color w:val="000000"/>
+              </w:rPr>
+            </w:pPr>
+            <w:r>
+              <w:rPr>
+                <w:rFonts w:ascii="Aptos Narrow" w:hAnsi="Aptos Narrow"/>
+                <w:color w:val="000000"/>
+              </w:rPr>
+              <w:t>(Deckers et al., 2022)</w:t>
+            </w:r>
+          </w:p>
+        </w:tc>
+        <w:tc>
+          <w:tcPr>
+            <w:tcW w:w="1456" w:type="dxa"/>
+          </w:tcPr>
+          <w:p>
+            <w:pPr>
+              <w:rPr>
+                <w:rFonts w:ascii="Aptos Narrow" w:hAnsi="Aptos Narrow"/>
+                <w:color w:val="000000"/>
+              </w:rPr>
+            </w:pPr>
+            <w:r>
+              <w:rPr>
+                <w:rFonts w:ascii="Aptos Narrow" w:hAnsi="Aptos Narrow"/>
+                <w:color w:val="000000"/>
+              </w:rPr>
+              <w:t xml:space="preserve">To fit light curves from 115 objects from the ZTF 2018 sample to a model grid that had various distributions of 56Ni shells with 67 % of them being explained as Chandrasekhar </w:t>
+            </w:r>
+            <w:r>
+              <w:rPr>
+                <w:rFonts w:ascii="Aptos Narrow" w:hAnsi="Aptos Narrow"/>
+                <w:color w:val="000000"/>
+              </w:rPr>
+              <w:lastRenderedPageBreak/>
+              <w:t xml:space="preserve">mass explosions. </w:t>
+            </w:r>
+          </w:p>
+          <w:p>
+            <w:pPr>
+              <w:rPr>
+                <w:rFonts w:ascii="Aptos Narrow" w:hAnsi="Aptos Narrow"/>
+                <w:color w:val="000000"/>
+              </w:rPr>
+            </w:pPr>
+          </w:p>
+          <w:p>
+            <w:pPr>
+              <w:rPr>
+                <w:rFonts w:ascii="Aptos Narrow" w:hAnsi="Aptos Narrow"/>
+                <w:color w:val="000000"/>
+              </w:rPr>
+            </w:pPr>
+            <w:r>
+              <w:rPr>
+                <w:rFonts w:ascii="Aptos Narrow" w:hAnsi="Aptos Narrow"/>
+                <w:color w:val="000000"/>
+              </w:rPr>
+              <w:t xml:space="preserve">Also attempted to explain the early excess fluxes appearing in 6 SNe  Ia by using the colours (g and r bands) and the lifetimes as explained by companion, CSM and 56Ni clump models.  </w:t>
+            </w:r>
+          </w:p>
+        </w:tc>
+        <w:tc>
+          <w:tcPr>
+            <w:tcW w:w="1534" w:type="dxa"/>
+          </w:tcPr>
+          <w:p>
+            <w:r>
+              <w:lastRenderedPageBreak/>
+              <w:t xml:space="preserve">Fitting experimental data from ZTF 2018 sample to the TURTLS model grid and attempting to constrain parameters to match light curves in the g and r band. </w:t>
+            </w:r>
+          </w:p>
+        </w:tc>
+        <w:tc>
+          <w:tcPr>
+            <w:tcW w:w="1482" w:type="dxa"/>
+          </w:tcPr>
+          <w:p>
+            <w:r>
+              <w:t xml:space="preserve">The supernovas fit to the TURTLS model grid of Chandrasekhar mass explosion with a range of 56 Ni distributions,  masses and explosion energies. With a preference for extended </w:t>
+            </w:r>
+            <w:r>
+              <w:lastRenderedPageBreak/>
+              <w:t xml:space="preserve">56Ni distributions. </w:t>
+            </w:r>
+          </w:p>
+          <w:p/>
+          <w:p>
+            <w:r>
+              <w:t xml:space="preserve">6 early flux excess SNe Ia are identified in the gr band data and they find with 18+-11 % </w:t>
+            </w:r>
+            <w:r>
+              <w:t xml:space="preserve">of finding early flux excess SNe Ia at z &lt; 0.07 and a correlation with lower galaxy mass but this was not statistically significant due to a lack of data. </w:t>
+            </w:r>
+            <w:r>
+              <w:t xml:space="preserve"> </w:t>
+            </w:r>
+          </w:p>
+        </w:tc>
+        <w:tc>
+          <w:tcPr>
+            <w:tcW w:w="1670" w:type="dxa"/>
+          </w:tcPr>
+          <w:p>
+            <w:r>
+              <w:lastRenderedPageBreak/>
+              <w:t>Lacking data specifically for the early flux excess SNe Ia to make conclusions regarding correlations about detection efficiencies.</w:t>
+            </w:r>
+          </w:p>
+          <w:p>
+            <w:r>
+              <w:t xml:space="preserve">Encourages the use of rapid detection </w:t>
+            </w:r>
+            <w:r>
+              <w:lastRenderedPageBreak/>
+              <w:t xml:space="preserve">of these SNe so spectroscopic follow up can occur which enables for progenitor mechanics to be thought about. </w:t>
+            </w:r>
+          </w:p>
+        </w:tc>
+        <w:tc>
+          <w:tcPr>
+            <w:tcW w:w="1496" w:type="dxa"/>
+          </w:tcPr>
+          <w:p>
+            <w:r>
+              <w:lastRenderedPageBreak/>
+              <w:t xml:space="preserve">I suspect Anais will ask me to focus on the early excess SNe Ia light curves as Rubin LSST will collect a lot of data with potentially more of these being found and </w:t>
+            </w:r>
+            <w:r>
+              <w:lastRenderedPageBreak/>
+              <w:t xml:space="preserve">supported by follow up spectroscopic observation. This will help greatly in the identification of the specific type of supernova and eventually I will investigate host properties of the galaxies with these supernovae. </w:t>
             </w:r>
           </w:p>
         </w:tc>

</xml_diff>

<commit_message>
Week 1: Saturday literature review and some note taking
</commit_message>
<xml_diff>
--- a/Literature_Matrix.docx
+++ b/Literature_Matrix.docx
@@ -477,6 +477,22 @@
                 <w:color w:val="000000"/>
               </w:rPr>
             </w:pPr>
+            <w:r>
+              <w:rPr>
+                <w:rFonts w:ascii="Aptos Narrow" w:hAnsi="Aptos Narrow"/>
+                <w:color w:val="000000"/>
+              </w:rPr>
+              <w:lastRenderedPageBreak/>
+              <w:t>Ramaiya et al., 2025</w:t>
+            </w:r>
+          </w:p>
+          <w:p>
+            <w:pPr>
+              <w:rPr>
+                <w:rFonts w:ascii="Aptos Narrow" w:hAnsi="Aptos Narrow"/>
+                <w:color w:val="000000"/>
+              </w:rPr>
+            </w:pPr>
           </w:p>
         </w:tc>
         <w:tc>
@@ -490,31 +506,62 @@
                 <w:color w:val="000000"/>
               </w:rPr>
             </w:pPr>
+            <w:r>
+              <w:rPr>
+                <w:rFonts w:ascii="Aptos Narrow" w:hAnsi="Aptos Narrow"/>
+                <w:color w:val="000000"/>
+              </w:rPr>
+              <w:t xml:space="preserve">Finding possible explanations to the colour – luminosity relation of SNe Ia with host galaxy properties. </w:t>
+            </w:r>
           </w:p>
         </w:tc>
         <w:tc>
           <w:tcPr>
             <w:tcW w:w="1534" w:type="dxa"/>
           </w:tcPr>
-          <w:p/>
+          <w:p>
+            <w:r>
+              <w:t>Experimental:</w:t>
+            </w:r>
+          </w:p>
+          <w:p>
+            <w:r>
+              <w:t xml:space="preserve">Used data for SNe Ia from DES and host galaxy data from a variety of telescopes and then plotting the SFR against the stellar mass </w:t>
+            </w:r>
+            <w:r>
+              <w:t xml:space="preserve">with the reddening of the host galaxy as well as splitting it into three regions of high mass bursting, low mass bursting and high mass passive galaxies. </w:t>
+            </w:r>
+          </w:p>
         </w:tc>
         <w:tc>
           <w:tcPr>
             <w:tcW w:w="1482" w:type="dxa"/>
           </w:tcPr>
-          <w:p/>
+          <w:p>
+            <w:r>
+              <w:t xml:space="preserve">That the slope of the SN colour luminosity relation is dependent of the region of the SFR vs Stellar mass plot based on the galaxy properties. As well as that SNe Ia are 0.07 to 0.11 mag brighter in High mass passive galaxies. </w:t>
+            </w:r>
+          </w:p>
         </w:tc>
         <w:tc>
           <w:tcPr>
             <w:tcW w:w="1670" w:type="dxa"/>
           </w:tcPr>
-          <w:p/>
+          <w:p>
+            <w:r>
+              <w:t xml:space="preserve">Small data issue seem to plague these studies as well as the methods used to determine the host galaxies of the SNe, although I didn’t read too deeply into methods. The paper specifically mentioned the relevance of the LSST using Rubin due to the large amounts of SNe that it’s expected to discover. </w:t>
+            </w:r>
+          </w:p>
         </w:tc>
         <w:tc>
           <w:tcPr>
             <w:tcW w:w="1496" w:type="dxa"/>
           </w:tcPr>
-          <w:p/>
+          <w:p>
+            <w:r>
+              <w:t xml:space="preserve">Literally is a study that I can use numbers and values from to compare to my research to understand my own results and how it fits into the context of the current research and literature. I suspect this will be one I return to. </w:t>
+            </w:r>
+          </w:p>
         </w:tc>
       </w:tr>
     </w:tbl>
@@ -1132,7 +1179,6 @@
   <w:style w:type="character" w:default="1" w:styleId="DefaultParagraphFont">
     <w:name w:val="Default Paragraph Font"/>
     <w:uiPriority w:val="1"/>
-    <w:semiHidden/>
     <w:unhideWhenUsed/>
   </w:style>
   <w:style w:type="table" w:default="1" w:styleId="TableNormal">

</xml_diff>

<commit_message>
Week 2: New paper read, summaries in literature review notebook and addition made to literature matrix
</commit_message>
<xml_diff>
--- a/Literature_Matrix.docx
+++ b/Literature_Matrix.docx
@@ -9,17 +9,17 @@
         <w:tblLook w:val="04A0" w:firstRow="1" w:lastRow="0" w:firstColumn="1" w:lastColumn="0" w:noHBand="0" w:noVBand="1"/>
       </w:tblPr>
       <w:tblGrid>
-        <w:gridCol w:w="1005"/>
-        <w:gridCol w:w="1557"/>
-        <w:gridCol w:w="1534"/>
-        <w:gridCol w:w="1676"/>
-        <w:gridCol w:w="1670"/>
-        <w:gridCol w:w="1574"/>
+        <w:gridCol w:w="1059"/>
+        <w:gridCol w:w="1536"/>
+        <w:gridCol w:w="1553"/>
+        <w:gridCol w:w="1653"/>
+        <w:gridCol w:w="1647"/>
+        <w:gridCol w:w="1568"/>
       </w:tblGrid>
       <w:tr>
         <w:tc>
           <w:tcPr>
-            <w:tcW w:w="1378" w:type="dxa"/>
+            <w:tcW w:w="1005" w:type="dxa"/>
           </w:tcPr>
           <w:p>
             <w:pPr>
@@ -40,7 +40,7 @@
         </w:tc>
         <w:tc>
           <w:tcPr>
-            <w:tcW w:w="1456" w:type="dxa"/>
+            <w:tcW w:w="1557" w:type="dxa"/>
           </w:tcPr>
           <w:p>
             <w:pPr>
@@ -87,7 +87,7 @@
         </w:tc>
         <w:tc>
           <w:tcPr>
-            <w:tcW w:w="1482" w:type="dxa"/>
+            <w:tcW w:w="1676" w:type="dxa"/>
           </w:tcPr>
           <w:p>
             <w:pPr>
@@ -126,7 +126,7 @@
         </w:tc>
         <w:tc>
           <w:tcPr>
-            <w:tcW w:w="1496" w:type="dxa"/>
+            <w:tcW w:w="1574" w:type="dxa"/>
           </w:tcPr>
           <w:p>
             <w:pPr>
@@ -154,7 +154,7 @@
       <w:tr>
         <w:tc>
           <w:tcPr>
-            <w:tcW w:w="1378" w:type="dxa"/>
+            <w:tcW w:w="1005" w:type="dxa"/>
           </w:tcPr>
           <w:p>
             <w:pPr>
@@ -175,7 +175,7 @@
         </w:tc>
         <w:tc>
           <w:tcPr>
-            <w:tcW w:w="1456" w:type="dxa"/>
+            <w:tcW w:w="1557" w:type="dxa"/>
           </w:tcPr>
           <w:p>
             <w:pPr>
@@ -206,7 +206,7 @@
         </w:tc>
         <w:tc>
           <w:tcPr>
-            <w:tcW w:w="1482" w:type="dxa"/>
+            <w:tcW w:w="1676" w:type="dxa"/>
           </w:tcPr>
           <w:p>
             <w:r>
@@ -226,7 +226,7 @@
         </w:tc>
         <w:tc>
           <w:tcPr>
-            <w:tcW w:w="1496" w:type="dxa"/>
+            <w:tcW w:w="1574" w:type="dxa"/>
           </w:tcPr>
           <w:p>
             <w:r>
@@ -238,7 +238,7 @@
       <w:tr>
         <w:tc>
           <w:tcPr>
-            <w:tcW w:w="1378" w:type="dxa"/>
+            <w:tcW w:w="1005" w:type="dxa"/>
           </w:tcPr>
           <w:p>
             <w:pPr>
@@ -258,7 +258,7 @@
         </w:tc>
         <w:tc>
           <w:tcPr>
-            <w:tcW w:w="1456" w:type="dxa"/>
+            <w:tcW w:w="1557" w:type="dxa"/>
           </w:tcPr>
           <w:p>
             <w:pPr>
@@ -291,7 +291,7 @@
         </w:tc>
         <w:tc>
           <w:tcPr>
-            <w:tcW w:w="1482" w:type="dxa"/>
+            <w:tcW w:w="1676" w:type="dxa"/>
           </w:tcPr>
           <w:p>
             <w:r>
@@ -311,7 +311,7 @@
         </w:tc>
         <w:tc>
           <w:tcPr>
-            <w:tcW w:w="1496" w:type="dxa"/>
+            <w:tcW w:w="1574" w:type="dxa"/>
           </w:tcPr>
           <w:p>
             <w:r>
@@ -323,7 +323,7 @@
       <w:tr>
         <w:tc>
           <w:tcPr>
-            <w:tcW w:w="1378" w:type="dxa"/>
+            <w:tcW w:w="1005" w:type="dxa"/>
           </w:tcPr>
           <w:p>
             <w:pPr>
@@ -343,21 +343,21 @@
         </w:tc>
         <w:tc>
           <w:tcPr>
-            <w:tcW w:w="1456" w:type="dxa"/>
-          </w:tcPr>
-          <w:p>
-            <w:pPr>
-              <w:rPr>
-                <w:rFonts w:ascii="Aptos Narrow" w:hAnsi="Aptos Narrow"/>
-                <w:color w:val="000000"/>
-              </w:rPr>
-            </w:pPr>
-            <w:r>
-              <w:rPr>
-                <w:rFonts w:ascii="Aptos Narrow" w:hAnsi="Aptos Narrow"/>
-                <w:color w:val="000000"/>
-              </w:rPr>
-              <w:t xml:space="preserve">To fit light curves from 115 objects from the ZTF 2018 sample to a model grid that had various distributions of 56Ni shells with 67 % of them being explained as Chandrasekhar </w:t>
+            <w:tcW w:w="1557" w:type="dxa"/>
+          </w:tcPr>
+          <w:p>
+            <w:pPr>
+              <w:rPr>
+                <w:rFonts w:ascii="Aptos Narrow" w:hAnsi="Aptos Narrow"/>
+                <w:color w:val="000000"/>
+              </w:rPr>
+            </w:pPr>
+            <w:r>
+              <w:rPr>
+                <w:rFonts w:ascii="Aptos Narrow" w:hAnsi="Aptos Narrow"/>
+                <w:color w:val="000000"/>
+              </w:rPr>
+              <w:t>To fit light curves from 115 objects from the ZTF 2018 sample to a model grid that had various distributions of 56Ni shells with 67 % of them being explained as Chandrasekha</w:t>
             </w:r>
             <w:r>
               <w:rPr>
@@ -365,7 +365,7 @@
                 <w:color w:val="000000"/>
               </w:rPr>
               <w:lastRenderedPageBreak/>
-              <w:t xml:space="preserve">mass explosions. </w:t>
+              <w:t xml:space="preserve">r mass explosions. </w:t>
             </w:r>
           </w:p>
           <w:p>
@@ -405,15 +405,15 @@
         </w:tc>
         <w:tc>
           <w:tcPr>
-            <w:tcW w:w="1482" w:type="dxa"/>
-          </w:tcPr>
-          <w:p>
-            <w:r>
-              <w:t xml:space="preserve">The supernovas fit to the TURTLS model grid of Chandrasekhar mass explosion with a range of 56 Ni distributions,  masses and explosion energies. With a preference for extended </w:t>
+            <w:tcW w:w="1676" w:type="dxa"/>
+          </w:tcPr>
+          <w:p>
+            <w:r>
+              <w:t xml:space="preserve">The supernovas fit to the TURTLS model grid of Chandrasekhar mass explosion with a range of 56 Ni distributions,  masses and explosion energies. With a preference </w:t>
             </w:r>
             <w:r>
               <w:lastRenderedPageBreak/>
-              <w:t xml:space="preserve">56Ni distributions. </w:t>
+              <w:t xml:space="preserve">for extended 56Ni distributions. </w:t>
             </w:r>
           </w:p>
           <w:p/>
@@ -441,17 +441,17 @@
           </w:p>
           <w:p>
             <w:r>
-              <w:t xml:space="preserve">Encourages the use of rapid detection </w:t>
+              <w:t xml:space="preserve">Encourages the use of rapid </w:t>
             </w:r>
             <w:r>
               <w:lastRenderedPageBreak/>
-              <w:t xml:space="preserve">of these SNe so spectroscopic follow up can occur which enables for progenitor mechanics to be thought about. </w:t>
-            </w:r>
-          </w:p>
-        </w:tc>
-        <w:tc>
-          <w:tcPr>
-            <w:tcW w:w="1496" w:type="dxa"/>
+              <w:t xml:space="preserve">detection of these SNe so spectroscopic follow up can occur which enables for progenitor mechanics to be thought about. </w:t>
+            </w:r>
+          </w:p>
+        </w:tc>
+        <w:tc>
+          <w:tcPr>
+            <w:tcW w:w="1574" w:type="dxa"/>
           </w:tcPr>
           <w:p>
             <w:r>
@@ -468,7 +468,7 @@
       <w:tr>
         <w:tc>
           <w:tcPr>
-            <w:tcW w:w="1378" w:type="dxa"/>
+            <w:tcW w:w="1005" w:type="dxa"/>
           </w:tcPr>
           <w:p>
             <w:pPr>
@@ -497,7 +497,7 @@
         </w:tc>
         <w:tc>
           <w:tcPr>
-            <w:tcW w:w="1456" w:type="dxa"/>
+            <w:tcW w:w="1557" w:type="dxa"/>
           </w:tcPr>
           <w:p>
             <w:pPr>
@@ -535,7 +535,7 @@
         </w:tc>
         <w:tc>
           <w:tcPr>
-            <w:tcW w:w="1482" w:type="dxa"/>
+            <w:tcW w:w="1676" w:type="dxa"/>
           </w:tcPr>
           <w:p>
             <w:r>
@@ -555,11 +555,146 @@
         </w:tc>
         <w:tc>
           <w:tcPr>
-            <w:tcW w:w="1496" w:type="dxa"/>
+            <w:tcW w:w="1574" w:type="dxa"/>
           </w:tcPr>
           <w:p>
             <w:r>
               <w:t xml:space="preserve">Literally is a study that I can use numbers and values from to compare to my research to understand my own results and how it fits into the context of the current research and literature. I suspect this will be one I return to. </w:t>
+            </w:r>
+          </w:p>
+        </w:tc>
+      </w:tr>
+      <w:tr>
+        <w:tc>
+          <w:tcPr>
+            <w:tcW w:w="1005" w:type="dxa"/>
+          </w:tcPr>
+          <w:p>
+            <w:pPr>
+              <w:rPr>
+                <w:rFonts w:ascii="Aptos Narrow" w:hAnsi="Aptos Narrow"/>
+                <w:color w:val="000000"/>
+              </w:rPr>
+            </w:pPr>
+            <w:r>
+              <w:rPr>
+                <w:rFonts w:ascii="Aptos Narrow" w:hAnsi="Aptos Narrow"/>
+                <w:color w:val="000000"/>
+              </w:rPr>
+              <w:t>(Srivastav et al., 2023)</w:t>
+            </w:r>
+          </w:p>
+        </w:tc>
+        <w:tc>
+          <w:tcPr>
+            <w:tcW w:w="1557" w:type="dxa"/>
+          </w:tcPr>
+          <w:p>
+            <w:pPr>
+              <w:rPr>
+                <w:rFonts w:ascii="Aptos Narrow" w:hAnsi="Aptos Narrow"/>
+                <w:color w:val="000000"/>
+              </w:rPr>
+            </w:pPr>
+            <w:r>
+              <w:rPr>
+                <w:rFonts w:ascii="Aptos Narrow" w:hAnsi="Aptos Narrow"/>
+                <w:color w:val="000000"/>
+              </w:rPr>
+              <w:t xml:space="preserve">Find appropriate constraints using a </w:t>
+            </w:r>
+            <w:proofErr w:type="spellStart"/>
+            <w:r>
+              <w:rPr>
+                <w:rFonts w:ascii="Aptos Narrow" w:hAnsi="Aptos Narrow"/>
+                <w:color w:val="000000"/>
+              </w:rPr>
+              <w:lastRenderedPageBreak/>
+              <w:t>MOSFiT</w:t>
+            </w:r>
+            <w:proofErr w:type="spellEnd"/>
+            <w:r>
+              <w:rPr>
+                <w:rFonts w:ascii="Aptos Narrow" w:hAnsi="Aptos Narrow"/>
+                <w:color w:val="000000"/>
+              </w:rPr>
+              <w:t xml:space="preserve"> model of hybrid 02es-like type Ia supernova to rule out the mechanisms of the explosion. </w:t>
+            </w:r>
+          </w:p>
+        </w:tc>
+        <w:tc>
+          <w:tcPr>
+            <w:tcW w:w="1534" w:type="dxa"/>
+          </w:tcPr>
+          <w:p>
+            <w:r>
+              <w:lastRenderedPageBreak/>
+              <w:t>Experimental:</w:t>
+            </w:r>
+          </w:p>
+          <w:p>
+            <w:r>
+              <w:t xml:space="preserve">Using photometric and </w:t>
+            </w:r>
+            <w:r>
+              <w:lastRenderedPageBreak/>
+              <w:t xml:space="preserve">spectroscopic data fit to a model for transient objects to classify the constraints for these curves to occur. </w:t>
+            </w:r>
+          </w:p>
+        </w:tc>
+        <w:tc>
+          <w:tcPr>
+            <w:tcW w:w="1676" w:type="dxa"/>
+          </w:tcPr>
+          <w:p>
+            <w:r>
+              <w:lastRenderedPageBreak/>
+              <w:t>(Srivastav et al., 2023)</w:t>
+            </w:r>
+            <w:r>
+              <w:t xml:space="preserve"> ruled out ejecta companion </w:t>
+            </w:r>
+            <w:r>
+              <w:lastRenderedPageBreak/>
+              <w:t xml:space="preserve">interaction, massive helium shell detonation and 56Ni distribution being drivers of the explosion and emphasised that the most reasonable explanation was the interaction of the SNe with the circumstellar medium. </w:t>
+            </w:r>
+          </w:p>
+        </w:tc>
+        <w:tc>
+          <w:tcPr>
+            <w:tcW w:w="1670" w:type="dxa"/>
+          </w:tcPr>
+          <w:p>
+            <w:r>
+              <w:lastRenderedPageBreak/>
+              <w:t xml:space="preserve">Limited access to follow up data limited the ability to </w:t>
+            </w:r>
+            <w:r>
+              <w:lastRenderedPageBreak/>
+              <w:t xml:space="preserve">place further constraints on the </w:t>
+            </w:r>
+            <w:proofErr w:type="spellStart"/>
+            <w:r>
+              <w:t>MOSFiT</w:t>
+            </w:r>
+            <w:proofErr w:type="spellEnd"/>
+            <w:r>
+              <w:t xml:space="preserve"> modelling to understand the cause of the circumstellar medium whether it was from tidal tails caused by WD merger event or disk originated matter caused by a disruption to the secondary white dwarf. </w:t>
+            </w:r>
+          </w:p>
+        </w:tc>
+        <w:tc>
+          <w:tcPr>
+            <w:tcW w:w="1574" w:type="dxa"/>
+          </w:tcPr>
+          <w:p>
+            <w:r>
+              <w:lastRenderedPageBreak/>
+              <w:t xml:space="preserve">As the scope of my project narrows I am looking for </w:t>
+            </w:r>
+            <w:r>
+              <w:lastRenderedPageBreak/>
+              <w:t xml:space="preserve">specific supernovae that are interesting to study, 02es types seem to have this early excess bump that I am interested in and this paper will help me in understanding the properties that lead to these early excess’s’. </w:t>
             </w:r>
           </w:p>
         </w:tc>

</xml_diff>

<commit_message>
06/03/2026: Made a new markdown file that outlines the structure and content of the literature review could look like, also made new addition to literature matrix and summaries in note book
</commit_message>
<xml_diff>
--- a/Literature_Matrix.docx
+++ b/Literature_Matrix.docx
@@ -19,7 +19,7 @@
       <w:tr>
         <w:tc>
           <w:tcPr>
-            <w:tcW w:w="1005" w:type="dxa"/>
+            <w:tcW w:w="1059" w:type="dxa"/>
           </w:tcPr>
           <w:p>
             <w:pPr>
@@ -40,7 +40,7 @@
         </w:tc>
         <w:tc>
           <w:tcPr>
-            <w:tcW w:w="1557" w:type="dxa"/>
+            <w:tcW w:w="1536" w:type="dxa"/>
           </w:tcPr>
           <w:p>
             <w:pPr>
@@ -61,7 +61,7 @@
         </w:tc>
         <w:tc>
           <w:tcPr>
-            <w:tcW w:w="1534" w:type="dxa"/>
+            <w:tcW w:w="1553" w:type="dxa"/>
           </w:tcPr>
           <w:p>
             <w:pPr>
@@ -87,7 +87,7 @@
         </w:tc>
         <w:tc>
           <w:tcPr>
-            <w:tcW w:w="1676" w:type="dxa"/>
+            <w:tcW w:w="1653" w:type="dxa"/>
           </w:tcPr>
           <w:p>
             <w:pPr>
@@ -100,7 +100,7 @@
         </w:tc>
         <w:tc>
           <w:tcPr>
-            <w:tcW w:w="1670" w:type="dxa"/>
+            <w:tcW w:w="1647" w:type="dxa"/>
           </w:tcPr>
           <w:p>
             <w:pPr>
@@ -126,7 +126,7 @@
         </w:tc>
         <w:tc>
           <w:tcPr>
-            <w:tcW w:w="1574" w:type="dxa"/>
+            <w:tcW w:w="1568" w:type="dxa"/>
           </w:tcPr>
           <w:p>
             <w:pPr>
@@ -154,7 +154,7 @@
       <w:tr>
         <w:tc>
           <w:tcPr>
-            <w:tcW w:w="1005" w:type="dxa"/>
+            <w:tcW w:w="1059" w:type="dxa"/>
           </w:tcPr>
           <w:p>
             <w:pPr>
@@ -175,7 +175,7 @@
         </w:tc>
         <w:tc>
           <w:tcPr>
-            <w:tcW w:w="1557" w:type="dxa"/>
+            <w:tcW w:w="1536" w:type="dxa"/>
           </w:tcPr>
           <w:p>
             <w:pPr>
@@ -196,7 +196,7 @@
         </w:tc>
         <w:tc>
           <w:tcPr>
-            <w:tcW w:w="1534" w:type="dxa"/>
+            <w:tcW w:w="1553" w:type="dxa"/>
           </w:tcPr>
           <w:p>
             <w:r>
@@ -206,7 +206,7 @@
         </w:tc>
         <w:tc>
           <w:tcPr>
-            <w:tcW w:w="1676" w:type="dxa"/>
+            <w:tcW w:w="1653" w:type="dxa"/>
           </w:tcPr>
           <w:p>
             <w:r>
@@ -216,7 +216,7 @@
         </w:tc>
         <w:tc>
           <w:tcPr>
-            <w:tcW w:w="1670" w:type="dxa"/>
+            <w:tcW w:w="1647" w:type="dxa"/>
           </w:tcPr>
           <w:p>
             <w:r>
@@ -226,7 +226,7 @@
         </w:tc>
         <w:tc>
           <w:tcPr>
-            <w:tcW w:w="1574" w:type="dxa"/>
+            <w:tcW w:w="1568" w:type="dxa"/>
           </w:tcPr>
           <w:p>
             <w:r>
@@ -238,7 +238,7 @@
       <w:tr>
         <w:tc>
           <w:tcPr>
-            <w:tcW w:w="1005" w:type="dxa"/>
+            <w:tcW w:w="1059" w:type="dxa"/>
           </w:tcPr>
           <w:p>
             <w:pPr>
@@ -258,7 +258,7 @@
         </w:tc>
         <w:tc>
           <w:tcPr>
-            <w:tcW w:w="1557" w:type="dxa"/>
+            <w:tcW w:w="1536" w:type="dxa"/>
           </w:tcPr>
           <w:p>
             <w:pPr>
@@ -278,7 +278,7 @@
         </w:tc>
         <w:tc>
           <w:tcPr>
-            <w:tcW w:w="1534" w:type="dxa"/>
+            <w:tcW w:w="1553" w:type="dxa"/>
           </w:tcPr>
           <w:p>
             <w:r>
@@ -291,7 +291,7 @@
         </w:tc>
         <w:tc>
           <w:tcPr>
-            <w:tcW w:w="1676" w:type="dxa"/>
+            <w:tcW w:w="1653" w:type="dxa"/>
           </w:tcPr>
           <w:p>
             <w:r>
@@ -301,7 +301,7 @@
         </w:tc>
         <w:tc>
           <w:tcPr>
-            <w:tcW w:w="1670" w:type="dxa"/>
+            <w:tcW w:w="1647" w:type="dxa"/>
           </w:tcPr>
           <w:p>
             <w:r>
@@ -311,7 +311,7 @@
         </w:tc>
         <w:tc>
           <w:tcPr>
-            <w:tcW w:w="1574" w:type="dxa"/>
+            <w:tcW w:w="1568" w:type="dxa"/>
           </w:tcPr>
           <w:p>
             <w:r>
@@ -323,7 +323,7 @@
       <w:tr>
         <w:tc>
           <w:tcPr>
-            <w:tcW w:w="1005" w:type="dxa"/>
+            <w:tcW w:w="1059" w:type="dxa"/>
           </w:tcPr>
           <w:p>
             <w:pPr>
@@ -343,7 +343,7 @@
         </w:tc>
         <w:tc>
           <w:tcPr>
-            <w:tcW w:w="1557" w:type="dxa"/>
+            <w:tcW w:w="1536" w:type="dxa"/>
           </w:tcPr>
           <w:p>
             <w:pPr>
@@ -394,7 +394,7 @@
         </w:tc>
         <w:tc>
           <w:tcPr>
-            <w:tcW w:w="1534" w:type="dxa"/>
+            <w:tcW w:w="1553" w:type="dxa"/>
           </w:tcPr>
           <w:p>
             <w:r>
@@ -405,7 +405,7 @@
         </w:tc>
         <w:tc>
           <w:tcPr>
-            <w:tcW w:w="1676" w:type="dxa"/>
+            <w:tcW w:w="1653" w:type="dxa"/>
           </w:tcPr>
           <w:p>
             <w:r>
@@ -419,7 +419,23 @@
           <w:p/>
           <w:p>
             <w:r>
-              <w:t xml:space="preserve">6 early flux excess SNe Ia are identified in the gr band data and they find with 18+-11 % </w:t>
+              <w:t xml:space="preserve">6 early </w:t>
+            </w:r>
+            <w:proofErr w:type="gramStart"/>
+            <w:r>
+              <w:t>flux</w:t>
+            </w:r>
+            <w:proofErr w:type="gramEnd"/>
+            <w:r>
+              <w:t xml:space="preserve"> excess SNe Ia are identified in the gr band </w:t>
+            </w:r>
+            <w:proofErr w:type="gramStart"/>
+            <w:r>
+              <w:t>data</w:t>
+            </w:r>
+            <w:proofErr w:type="gramEnd"/>
+            <w:r>
+              <w:t xml:space="preserve"> and they find with 18+-11 % </w:t>
             </w:r>
             <w:r>
               <w:t xml:space="preserve">of finding early flux excess SNe Ia at z &lt; 0.07 and a correlation with lower galaxy mass but this was not statistically significant due to a lack of data. </w:t>
@@ -431,7 +447,7 @@
         </w:tc>
         <w:tc>
           <w:tcPr>
-            <w:tcW w:w="1670" w:type="dxa"/>
+            <w:tcW w:w="1647" w:type="dxa"/>
           </w:tcPr>
           <w:p>
             <w:r>
@@ -451,7 +467,7 @@
         </w:tc>
         <w:tc>
           <w:tcPr>
-            <w:tcW w:w="1574" w:type="dxa"/>
+            <w:tcW w:w="1568" w:type="dxa"/>
           </w:tcPr>
           <w:p>
             <w:r>
@@ -468,7 +484,7 @@
       <w:tr>
         <w:tc>
           <w:tcPr>
-            <w:tcW w:w="1005" w:type="dxa"/>
+            <w:tcW w:w="1059" w:type="dxa"/>
           </w:tcPr>
           <w:p>
             <w:pPr>
@@ -497,7 +513,7 @@
         </w:tc>
         <w:tc>
           <w:tcPr>
-            <w:tcW w:w="1557" w:type="dxa"/>
+            <w:tcW w:w="1536" w:type="dxa"/>
           </w:tcPr>
           <w:p>
             <w:pPr>
@@ -517,7 +533,7 @@
         </w:tc>
         <w:tc>
           <w:tcPr>
-            <w:tcW w:w="1534" w:type="dxa"/>
+            <w:tcW w:w="1553" w:type="dxa"/>
           </w:tcPr>
           <w:p>
             <w:r>
@@ -535,7 +551,7 @@
         </w:tc>
         <w:tc>
           <w:tcPr>
-            <w:tcW w:w="1676" w:type="dxa"/>
+            <w:tcW w:w="1653" w:type="dxa"/>
           </w:tcPr>
           <w:p>
             <w:r>
@@ -545,17 +561,25 @@
         </w:tc>
         <w:tc>
           <w:tcPr>
-            <w:tcW w:w="1670" w:type="dxa"/>
-          </w:tcPr>
-          <w:p>
-            <w:r>
-              <w:t xml:space="preserve">Small data issue seem to plague these studies as well as the methods used to determine the host galaxies of the SNe, although I didn’t read too deeply into methods. The paper specifically mentioned the relevance of the LSST using Rubin due to the large amounts of SNe that it’s expected to discover. </w:t>
-            </w:r>
-          </w:p>
-        </w:tc>
-        <w:tc>
-          <w:tcPr>
-            <w:tcW w:w="1574" w:type="dxa"/>
+            <w:tcW w:w="1647" w:type="dxa"/>
+          </w:tcPr>
+          <w:p>
+            <w:r>
+              <w:t xml:space="preserve">Small data issue </w:t>
+            </w:r>
+            <w:proofErr w:type="gramStart"/>
+            <w:r>
+              <w:t>seem</w:t>
+            </w:r>
+            <w:proofErr w:type="gramEnd"/>
+            <w:r>
+              <w:t xml:space="preserve"> to plague these studies as well as the methods used to determine the host galaxies of the SNe, although I didn’t read too deeply into methods. The paper specifically mentioned the relevance of the LSST using Rubin due to the large amounts of SNe that it’s expected to discover. </w:t>
+            </w:r>
+          </w:p>
+        </w:tc>
+        <w:tc>
+          <w:tcPr>
+            <w:tcW w:w="1568" w:type="dxa"/>
           </w:tcPr>
           <w:p>
             <w:r>
@@ -567,7 +591,7 @@
       <w:tr>
         <w:tc>
           <w:tcPr>
-            <w:tcW w:w="1005" w:type="dxa"/>
+            <w:tcW w:w="1059" w:type="dxa"/>
           </w:tcPr>
           <w:p>
             <w:pPr>
@@ -587,7 +611,7 @@
         </w:tc>
         <w:tc>
           <w:tcPr>
-            <w:tcW w:w="1557" w:type="dxa"/>
+            <w:tcW w:w="1536" w:type="dxa"/>
           </w:tcPr>
           <w:p>
             <w:pPr>
@@ -624,7 +648,7 @@
         </w:tc>
         <w:tc>
           <w:tcPr>
-            <w:tcW w:w="1534" w:type="dxa"/>
+            <w:tcW w:w="1553" w:type="dxa"/>
           </w:tcPr>
           <w:p>
             <w:r>
@@ -644,7 +668,7 @@
         </w:tc>
         <w:tc>
           <w:tcPr>
-            <w:tcW w:w="1676" w:type="dxa"/>
+            <w:tcW w:w="1653" w:type="dxa"/>
           </w:tcPr>
           <w:p>
             <w:r>
@@ -662,7 +686,7 @@
         </w:tc>
         <w:tc>
           <w:tcPr>
-            <w:tcW w:w="1670" w:type="dxa"/>
+            <w:tcW w:w="1647" w:type="dxa"/>
           </w:tcPr>
           <w:p>
             <w:r>
@@ -685,7 +709,7 @@
         </w:tc>
         <w:tc>
           <w:tcPr>
-            <w:tcW w:w="1574" w:type="dxa"/>
+            <w:tcW w:w="1568" w:type="dxa"/>
           </w:tcPr>
           <w:p>
             <w:r>
@@ -697,6 +721,155 @@
               <w:t xml:space="preserve">specific supernovae that are interesting to study, 02es types seem to have this early excess bump that I am interested in and this paper will help me in understanding the properties that lead to these early excess’s’. </w:t>
             </w:r>
           </w:p>
+        </w:tc>
+      </w:tr>
+      <w:tr>
+        <w:tc>
+          <w:tcPr>
+            <w:tcW w:w="1059" w:type="dxa"/>
+          </w:tcPr>
+          <w:p>
+            <w:pPr>
+              <w:rPr>
+                <w:rFonts w:ascii="Aptos Narrow" w:hAnsi="Aptos Narrow"/>
+                <w:color w:val="000000"/>
+              </w:rPr>
+            </w:pPr>
+            <w:r>
+              <w:rPr>
+                <w:rFonts w:ascii="Aptos Narrow" w:hAnsi="Aptos Narrow"/>
+                <w:color w:val="000000"/>
+              </w:rPr>
+              <w:lastRenderedPageBreak/>
+              <w:t>(Leoni et al., 2022)</w:t>
+            </w:r>
+          </w:p>
+        </w:tc>
+        <w:tc>
+          <w:tcPr>
+            <w:tcW w:w="1536" w:type="dxa"/>
+          </w:tcPr>
+          <w:p>
+            <w:pPr>
+              <w:rPr>
+                <w:rFonts w:ascii="Aptos Narrow" w:hAnsi="Aptos Narrow"/>
+                <w:color w:val="000000"/>
+              </w:rPr>
+            </w:pPr>
+            <w:r>
+              <w:rPr>
+                <w:rFonts w:ascii="Aptos Narrow" w:hAnsi="Aptos Narrow"/>
+                <w:color w:val="000000"/>
+              </w:rPr>
+              <w:t xml:space="preserve">To demonstrate how an active learning loop can be an effective method to sample a new training dataset for a classification model given small validation data. </w:t>
+            </w:r>
+          </w:p>
+        </w:tc>
+        <w:tc>
+          <w:tcPr>
+            <w:tcW w:w="1553" w:type="dxa"/>
+          </w:tcPr>
+          <w:p>
+            <w:r>
+              <w:t xml:space="preserve">A pipeline of filtering, feature extraction and then classification to create the sample that the true model will be retrained on. </w:t>
+            </w:r>
+          </w:p>
+        </w:tc>
+        <w:tc>
+          <w:tcPr>
+            <w:tcW w:w="1653" w:type="dxa"/>
+          </w:tcPr>
+          <w:p>
+            <w:r>
+              <w:t>That an active training regime using uncertainty sampling can be an effective method to create training datasets that can be used to retrain a classification model like that on Fink. This active learning regime achieved a purity of 89 per cent and an efficiency of 54 per cent using uncertainty sampling.</w:t>
+            </w:r>
+          </w:p>
+        </w:tc>
+        <w:tc>
+          <w:tcPr>
+            <w:tcW w:w="1647" w:type="dxa"/>
+          </w:tcPr>
+          <w:p>
+            <w:r>
+              <w:t xml:space="preserve">Limitations are I think in the classification of other transients as the other classes were broad brushed such as AGN-like and </w:t>
+            </w:r>
+            <w:proofErr w:type="spellStart"/>
+            <w:r>
+              <w:t>other_SN</w:t>
+            </w:r>
+            <w:proofErr w:type="spellEnd"/>
+            <w:r>
+              <w:t xml:space="preserve"> as well as how this will be effectively implemented into the retraining of the Fink Supernova classification module.</w:t>
+            </w:r>
+          </w:p>
+        </w:tc>
+        <w:tc>
+          <w:tcPr>
+            <w:tcW w:w="1568" w:type="dxa"/>
+          </w:tcPr>
+          <w:p>
+            <w:r>
+              <w:t xml:space="preserve">This gives me more context to how Fink works when classifying the data that I will be using for my project. I need to be able to understand where the data comes from and how it is processed </w:t>
+            </w:r>
+            <w:r>
+              <w:t>to</w:t>
+            </w:r>
+            <w:r>
+              <w:t xml:space="preserve"> analyse it effectively. </w:t>
+            </w:r>
+          </w:p>
+        </w:tc>
+      </w:tr>
+      <w:tr>
+        <w:tc>
+          <w:tcPr>
+            <w:tcW w:w="1059" w:type="dxa"/>
+          </w:tcPr>
+          <w:p>
+            <w:pPr>
+              <w:rPr>
+                <w:rFonts w:ascii="Aptos Narrow" w:hAnsi="Aptos Narrow"/>
+                <w:color w:val="000000"/>
+              </w:rPr>
+            </w:pPr>
+          </w:p>
+        </w:tc>
+        <w:tc>
+          <w:tcPr>
+            <w:tcW w:w="1536" w:type="dxa"/>
+          </w:tcPr>
+          <w:p>
+            <w:pPr>
+              <w:rPr>
+                <w:rFonts w:ascii="Aptos Narrow" w:hAnsi="Aptos Narrow"/>
+                <w:color w:val="000000"/>
+              </w:rPr>
+            </w:pPr>
+          </w:p>
+        </w:tc>
+        <w:tc>
+          <w:tcPr>
+            <w:tcW w:w="1553" w:type="dxa"/>
+          </w:tcPr>
+          <w:p/>
+        </w:tc>
+        <w:tc>
+          <w:tcPr>
+            <w:tcW w:w="1653" w:type="dxa"/>
+          </w:tcPr>
+          <w:p/>
+        </w:tc>
+        <w:tc>
+          <w:tcPr>
+            <w:tcW w:w="1647" w:type="dxa"/>
+          </w:tcPr>
+          <w:p/>
+        </w:tc>
+        <w:tc>
+          <w:tcPr>
+            <w:tcW w:w="1568" w:type="dxa"/>
+          </w:tcPr>
+          <w:p/>
         </w:tc>
       </w:tr>
     </w:tbl>

</xml_diff>

<commit_message>
07/03/2026: Some additional reading for the bibliography, wrote the Anderson 2015 summary in notebooks and added an entry to the literature matrix for this article
</commit_message>
<xml_diff>
--- a/Literature_Matrix.docx
+++ b/Literature_Matrix.docx
@@ -9,12 +9,12 @@
         <w:tblLook w:val="04A0" w:firstRow="1" w:lastRow="0" w:firstColumn="1" w:lastColumn="0" w:noHBand="0" w:noVBand="1"/>
       </w:tblPr>
       <w:tblGrid>
-        <w:gridCol w:w="1059"/>
-        <w:gridCol w:w="1536"/>
-        <w:gridCol w:w="1553"/>
-        <w:gridCol w:w="1653"/>
-        <w:gridCol w:w="1647"/>
-        <w:gridCol w:w="1568"/>
+        <w:gridCol w:w="1099"/>
+        <w:gridCol w:w="1528"/>
+        <w:gridCol w:w="1545"/>
+        <w:gridCol w:w="1645"/>
+        <w:gridCol w:w="1639"/>
+        <w:gridCol w:w="1560"/>
       </w:tblGrid>
       <w:tr>
         <w:tc>
@@ -419,23 +419,7 @@
           <w:p/>
           <w:p>
             <w:r>
-              <w:t xml:space="preserve">6 early </w:t>
-            </w:r>
-            <w:proofErr w:type="gramStart"/>
-            <w:r>
-              <w:t>flux</w:t>
-            </w:r>
-            <w:proofErr w:type="gramEnd"/>
-            <w:r>
-              <w:t xml:space="preserve"> excess SNe Ia are identified in the gr band </w:t>
-            </w:r>
-            <w:proofErr w:type="gramStart"/>
-            <w:r>
-              <w:t>data</w:t>
-            </w:r>
-            <w:proofErr w:type="gramEnd"/>
-            <w:r>
-              <w:t xml:space="preserve"> and they find with 18+-11 % </w:t>
+              <w:t xml:space="preserve">6 early flux excess SNe Ia are identified in the gr band data and they find with 18+-11 % </w:t>
             </w:r>
             <w:r>
               <w:t xml:space="preserve">of finding early flux excess SNe Ia at z &lt; 0.07 and a correlation with lower galaxy mass but this was not statistically significant due to a lack of data. </w:t>
@@ -565,15 +549,7 @@
           </w:tcPr>
           <w:p>
             <w:r>
-              <w:t xml:space="preserve">Small data issue </w:t>
-            </w:r>
-            <w:proofErr w:type="gramStart"/>
-            <w:r>
-              <w:t>seem</w:t>
-            </w:r>
-            <w:proofErr w:type="gramEnd"/>
-            <w:r>
-              <w:t xml:space="preserve"> to plague these studies as well as the methods used to determine the host galaxies of the SNe, although I didn’t read too deeply into methods. The paper specifically mentioned the relevance of the LSST using Rubin due to the large amounts of SNe that it’s expected to discover. </w:t>
+              <w:t xml:space="preserve">Small data issue seem to plague these studies as well as the methods used to determine the host galaxies of the SNe, although I didn’t read too deeply into methods. The paper specifically mentioned the relevance of the LSST using Rubin due to the large amounts of SNe that it’s expected to discover. </w:t>
             </w:r>
           </w:p>
         </w:tc>
@@ -625,24 +601,15 @@
                 <w:rFonts w:ascii="Aptos Narrow" w:hAnsi="Aptos Narrow"/>
                 <w:color w:val="000000"/>
               </w:rPr>
-              <w:t xml:space="preserve">Find appropriate constraints using a </w:t>
-            </w:r>
-            <w:proofErr w:type="spellStart"/>
-            <w:r>
-              <w:rPr>
-                <w:rFonts w:ascii="Aptos Narrow" w:hAnsi="Aptos Narrow"/>
-                <w:color w:val="000000"/>
-              </w:rPr>
-              <w:lastRenderedPageBreak/>
-              <w:t>MOSFiT</w:t>
-            </w:r>
-            <w:proofErr w:type="spellEnd"/>
-            <w:r>
-              <w:rPr>
-                <w:rFonts w:ascii="Aptos Narrow" w:hAnsi="Aptos Narrow"/>
-                <w:color w:val="000000"/>
-              </w:rPr>
-              <w:t xml:space="preserve"> model of hybrid 02es-like type Ia supernova to rule out the mechanisms of the explosion. </w:t>
+              <w:t xml:space="preserve">Find appropriate constraints </w:t>
+            </w:r>
+            <w:r>
+              <w:rPr>
+                <w:rFonts w:ascii="Aptos Narrow" w:hAnsi="Aptos Narrow"/>
+                <w:color w:val="000000"/>
+              </w:rPr>
+              <w:lastRenderedPageBreak/>
+              <w:t xml:space="preserve">using a MOSFiT model of hybrid 02es-like type Ia supernova to rule out the mechanisms of the explosion. </w:t>
             </w:r>
           </w:p>
         </w:tc>
@@ -658,11 +625,11 @@
           </w:p>
           <w:p>
             <w:r>
-              <w:t xml:space="preserve">Using photometric and </w:t>
-            </w:r>
-            <w:r>
-              <w:lastRenderedPageBreak/>
-              <w:t xml:space="preserve">spectroscopic data fit to a model for transient objects to classify the constraints for these curves to occur. </w:t>
+              <w:t xml:space="preserve">Using photometric </w:t>
+            </w:r>
+            <w:r>
+              <w:lastRenderedPageBreak/>
+              <w:t xml:space="preserve">and spectroscopic data fit to a model for transient objects to classify the constraints for these curves to occur. </w:t>
             </w:r>
           </w:p>
         </w:tc>
@@ -676,11 +643,11 @@
               <w:t>(Srivastav et al., 2023)</w:t>
             </w:r>
             <w:r>
-              <w:t xml:space="preserve"> ruled out ejecta companion </w:t>
-            </w:r>
-            <w:r>
-              <w:lastRenderedPageBreak/>
-              <w:t xml:space="preserve">interaction, massive helium shell detonation and 56Ni distribution being drivers of the explosion and emphasised that the most reasonable explanation was the interaction of the SNe with the circumstellar medium. </w:t>
+              <w:t xml:space="preserve"> ruled out ejecta </w:t>
+            </w:r>
+            <w:r>
+              <w:lastRenderedPageBreak/>
+              <w:t xml:space="preserve">companion interaction, massive helium shell detonation and 56Ni distribution being drivers of the explosion and emphasised that the most reasonable explanation was the interaction of the SNe with the circumstellar medium. </w:t>
             </w:r>
           </w:p>
         </w:tc>
@@ -691,19 +658,11 @@
           <w:p>
             <w:r>
               <w:lastRenderedPageBreak/>
-              <w:t xml:space="preserve">Limited access to follow up data limited the ability to </w:t>
-            </w:r>
-            <w:r>
-              <w:lastRenderedPageBreak/>
-              <w:t xml:space="preserve">place further constraints on the </w:t>
-            </w:r>
-            <w:proofErr w:type="spellStart"/>
-            <w:r>
-              <w:t>MOSFiT</w:t>
-            </w:r>
-            <w:proofErr w:type="spellEnd"/>
-            <w:r>
-              <w:t xml:space="preserve"> modelling to understand the cause of the circumstellar medium whether it was from tidal tails caused by WD merger event or disk originated matter caused by a disruption to the secondary white dwarf. </w:t>
+              <w:t xml:space="preserve">Limited access to follow up data </w:t>
+            </w:r>
+            <w:r>
+              <w:lastRenderedPageBreak/>
+              <w:t xml:space="preserve">limited the ability to place further constraints on the MOSFiT modelling to understand the cause of the circumstellar medium whether it was from tidal tails caused by WD merger event or disk originated matter caused by a disruption to the secondary white dwarf. </w:t>
             </w:r>
           </w:p>
         </w:tc>
@@ -714,11 +673,11 @@
           <w:p>
             <w:r>
               <w:lastRenderedPageBreak/>
-              <w:t xml:space="preserve">As the scope of my project narrows I am looking for </w:t>
-            </w:r>
-            <w:r>
-              <w:lastRenderedPageBreak/>
-              <w:t xml:space="preserve">specific supernovae that are interesting to study, 02es types seem to have this early excess bump that I am interested in and this paper will help me in understanding the properties that lead to these early excess’s’. </w:t>
+              <w:t xml:space="preserve">As the scope of my project narrows I am </w:t>
+            </w:r>
+            <w:r>
+              <w:lastRenderedPageBreak/>
+              <w:t xml:space="preserve">looking for specific supernovae that are interesting to study, 02es types seem to have this early excess bump that I am interested in and this paper will help me in understanding the properties that lead to these early excess’s’. </w:t>
             </w:r>
           </w:p>
         </w:tc>
@@ -791,15 +750,7 @@
           </w:tcPr>
           <w:p>
             <w:r>
-              <w:t xml:space="preserve">Limitations are I think in the classification of other transients as the other classes were broad brushed such as AGN-like and </w:t>
-            </w:r>
-            <w:proofErr w:type="spellStart"/>
-            <w:r>
-              <w:t>other_SN</w:t>
-            </w:r>
-            <w:proofErr w:type="spellEnd"/>
-            <w:r>
-              <w:t xml:space="preserve"> as well as how this will be effectively implemented into the retraining of the Fink Supernova classification module.</w:t>
+              <w:t>Limitations are I think in the classification of other transients as the other classes were broad brushed such as AGN-like and other_SN as well as how this will be effectively implemented into the retraining of the Fink Supernova classification module.</w:t>
             </w:r>
           </w:p>
         </w:tc>
@@ -832,6 +783,13 @@
                 <w:color w:val="000000"/>
               </w:rPr>
             </w:pPr>
+            <w:r>
+              <w:rPr>
+                <w:rFonts w:ascii="Aptos Narrow" w:hAnsi="Aptos Narrow"/>
+                <w:color w:val="000000"/>
+              </w:rPr>
+              <w:t>(Anderson et al., 2015)</w:t>
+            </w:r>
           </w:p>
         </w:tc>
         <w:tc>
@@ -845,31 +803,85 @@
                 <w:color w:val="000000"/>
               </w:rPr>
             </w:pPr>
+            <w:r>
+              <w:rPr>
+                <w:rFonts w:ascii="Aptos Narrow" w:hAnsi="Aptos Narrow"/>
+                <w:color w:val="000000"/>
+              </w:rPr>
+              <w:t xml:space="preserve">Using different bands flux data for 102 star forming  host galaxies </w:t>
+            </w:r>
+            <w:r>
+              <w:rPr>
+                <w:rFonts w:ascii="Aptos Narrow" w:hAnsi="Aptos Narrow"/>
+                <w:color w:val="000000"/>
+              </w:rPr>
+              <w:lastRenderedPageBreak/>
+              <w:t xml:space="preserve">to trace out what band types of supernovae are appearing in. This leads to the constraints that can be placed on the time delay distribution between when the explosion happens and what the progenitor was. </w:t>
+            </w:r>
           </w:p>
         </w:tc>
         <w:tc>
           <w:tcPr>
             <w:tcW w:w="1553" w:type="dxa"/>
           </w:tcPr>
-          <w:p/>
+          <w:p>
+            <w:r>
+              <w:lastRenderedPageBreak/>
+              <w:t xml:space="preserve">Experimental: Fitting supernovas occurring in different </w:t>
+            </w:r>
+            <w:r>
+              <w:lastRenderedPageBreak/>
+              <w:t>bands of light from host galaxies using a pixel statistic NCR method. Host galaxies emit light from different parts of the galaxy so finding what band the supernovae are occurring in can find a spatial correlation with the host galaxy.</w:t>
+            </w:r>
+          </w:p>
         </w:tc>
         <w:tc>
           <w:tcPr>
             <w:tcW w:w="1653" w:type="dxa"/>
           </w:tcPr>
-          <w:p/>
+          <w:p>
+            <w:r>
+              <w:lastRenderedPageBreak/>
+              <w:t xml:space="preserve">That SNe Ia are occurring in the blue band of these host galaxies which </w:t>
+            </w:r>
+            <w:r>
+              <w:lastRenderedPageBreak/>
+              <w:t xml:space="preserve">shows that </w:t>
+            </w:r>
+            <w:r>
+              <w:t>the progenitor of the SNe Ia cannot have a tiem delay of less than 100 Myr. Because otherwise you would see the supernovae fitting to the cumulative distribution in the H alpha and UV bands. But they did not fit to these bands.</w:t>
+            </w:r>
+          </w:p>
         </w:tc>
         <w:tc>
           <w:tcPr>
             <w:tcW w:w="1647" w:type="dxa"/>
           </w:tcPr>
-          <w:p/>
+          <w:p>
+            <w:r>
+              <w:lastRenderedPageBreak/>
+              <w:t xml:space="preserve">No consideration of how dust affects results and limited </w:t>
+            </w:r>
+            <w:r>
+              <w:lastRenderedPageBreak/>
+              <w:t xml:space="preserve">conclusions on constraints placed on progenitor channels. </w:t>
+            </w:r>
+          </w:p>
         </w:tc>
         <w:tc>
           <w:tcPr>
             <w:tcW w:w="1568" w:type="dxa"/>
           </w:tcPr>
-          <w:p/>
+          <w:p>
+            <w:r>
+              <w:lastRenderedPageBreak/>
+              <w:t xml:space="preserve">This shows how the type of SN that I am searching for is more </w:t>
+            </w:r>
+            <w:r>
+              <w:lastRenderedPageBreak/>
+              <w:t>likely to be found in the blue bands of host galaxies, this will be crucial in developing the sample of SNe that I will search for Early Excess SNe in as these Early Execess SNe only occur in type Ias</w:t>
+            </w:r>
+          </w:p>
         </w:tc>
       </w:tr>
     </w:tbl>

</xml_diff>

<commit_message>
11/03/2026: Updated literature matrix with Rigault et al., 2020 entry added into literature review notebook, as well as an entry into literature matrix
</commit_message>
<xml_diff>
--- a/Literature_Matrix.docx
+++ b/Literature_Matrix.docx
@@ -9,17 +9,17 @@
         <w:tblLook w:val="04A0" w:firstRow="1" w:lastRow="0" w:firstColumn="1" w:lastColumn="0" w:noHBand="0" w:noVBand="1"/>
       </w:tblPr>
       <w:tblGrid>
-        <w:gridCol w:w="1099"/>
-        <w:gridCol w:w="1528"/>
-        <w:gridCol w:w="1545"/>
-        <w:gridCol w:w="1645"/>
-        <w:gridCol w:w="1639"/>
-        <w:gridCol w:w="1560"/>
+        <w:gridCol w:w="1095"/>
+        <w:gridCol w:w="1549"/>
+        <w:gridCol w:w="1541"/>
+        <w:gridCol w:w="1640"/>
+        <w:gridCol w:w="1635"/>
+        <w:gridCol w:w="1556"/>
       </w:tblGrid>
       <w:tr>
         <w:tc>
           <w:tcPr>
-            <w:tcW w:w="1059" w:type="dxa"/>
+            <w:tcW w:w="1099" w:type="dxa"/>
           </w:tcPr>
           <w:p>
             <w:pPr>
@@ -40,7 +40,7 @@
         </w:tc>
         <w:tc>
           <w:tcPr>
-            <w:tcW w:w="1536" w:type="dxa"/>
+            <w:tcW w:w="1528" w:type="dxa"/>
           </w:tcPr>
           <w:p>
             <w:pPr>
@@ -61,7 +61,7 @@
         </w:tc>
         <w:tc>
           <w:tcPr>
-            <w:tcW w:w="1553" w:type="dxa"/>
+            <w:tcW w:w="1545" w:type="dxa"/>
           </w:tcPr>
           <w:p>
             <w:pPr>
@@ -87,7 +87,7 @@
         </w:tc>
         <w:tc>
           <w:tcPr>
-            <w:tcW w:w="1653" w:type="dxa"/>
+            <w:tcW w:w="1645" w:type="dxa"/>
           </w:tcPr>
           <w:p>
             <w:pPr>
@@ -100,7 +100,7 @@
         </w:tc>
         <w:tc>
           <w:tcPr>
-            <w:tcW w:w="1647" w:type="dxa"/>
+            <w:tcW w:w="1639" w:type="dxa"/>
           </w:tcPr>
           <w:p>
             <w:pPr>
@@ -126,7 +126,7 @@
         </w:tc>
         <w:tc>
           <w:tcPr>
-            <w:tcW w:w="1568" w:type="dxa"/>
+            <w:tcW w:w="1560" w:type="dxa"/>
           </w:tcPr>
           <w:p>
             <w:pPr>
@@ -154,7 +154,7 @@
       <w:tr>
         <w:tc>
           <w:tcPr>
-            <w:tcW w:w="1059" w:type="dxa"/>
+            <w:tcW w:w="1099" w:type="dxa"/>
           </w:tcPr>
           <w:p>
             <w:pPr>
@@ -175,7 +175,7 @@
         </w:tc>
         <w:tc>
           <w:tcPr>
-            <w:tcW w:w="1536" w:type="dxa"/>
+            <w:tcW w:w="1528" w:type="dxa"/>
           </w:tcPr>
           <w:p>
             <w:pPr>
@@ -196,7 +196,7 @@
         </w:tc>
         <w:tc>
           <w:tcPr>
-            <w:tcW w:w="1553" w:type="dxa"/>
+            <w:tcW w:w="1545" w:type="dxa"/>
           </w:tcPr>
           <w:p>
             <w:r>
@@ -206,7 +206,7 @@
         </w:tc>
         <w:tc>
           <w:tcPr>
-            <w:tcW w:w="1653" w:type="dxa"/>
+            <w:tcW w:w="1645" w:type="dxa"/>
           </w:tcPr>
           <w:p>
             <w:r>
@@ -216,7 +216,7 @@
         </w:tc>
         <w:tc>
           <w:tcPr>
-            <w:tcW w:w="1647" w:type="dxa"/>
+            <w:tcW w:w="1639" w:type="dxa"/>
           </w:tcPr>
           <w:p>
             <w:r>
@@ -226,7 +226,7 @@
         </w:tc>
         <w:tc>
           <w:tcPr>
-            <w:tcW w:w="1568" w:type="dxa"/>
+            <w:tcW w:w="1560" w:type="dxa"/>
           </w:tcPr>
           <w:p>
             <w:r>
@@ -238,7 +238,7 @@
       <w:tr>
         <w:tc>
           <w:tcPr>
-            <w:tcW w:w="1059" w:type="dxa"/>
+            <w:tcW w:w="1099" w:type="dxa"/>
           </w:tcPr>
           <w:p>
             <w:pPr>
@@ -258,7 +258,7 @@
         </w:tc>
         <w:tc>
           <w:tcPr>
-            <w:tcW w:w="1536" w:type="dxa"/>
+            <w:tcW w:w="1528" w:type="dxa"/>
           </w:tcPr>
           <w:p>
             <w:pPr>
@@ -278,7 +278,7 @@
         </w:tc>
         <w:tc>
           <w:tcPr>
-            <w:tcW w:w="1553" w:type="dxa"/>
+            <w:tcW w:w="1545" w:type="dxa"/>
           </w:tcPr>
           <w:p>
             <w:r>
@@ -291,7 +291,7 @@
         </w:tc>
         <w:tc>
           <w:tcPr>
-            <w:tcW w:w="1653" w:type="dxa"/>
+            <w:tcW w:w="1645" w:type="dxa"/>
           </w:tcPr>
           <w:p>
             <w:r>
@@ -301,7 +301,7 @@
         </w:tc>
         <w:tc>
           <w:tcPr>
-            <w:tcW w:w="1647" w:type="dxa"/>
+            <w:tcW w:w="1639" w:type="dxa"/>
           </w:tcPr>
           <w:p>
             <w:r>
@@ -311,7 +311,7 @@
         </w:tc>
         <w:tc>
           <w:tcPr>
-            <w:tcW w:w="1568" w:type="dxa"/>
+            <w:tcW w:w="1560" w:type="dxa"/>
           </w:tcPr>
           <w:p>
             <w:r>
@@ -323,7 +323,7 @@
       <w:tr>
         <w:tc>
           <w:tcPr>
-            <w:tcW w:w="1059" w:type="dxa"/>
+            <w:tcW w:w="1099" w:type="dxa"/>
           </w:tcPr>
           <w:p>
             <w:pPr>
@@ -343,7 +343,7 @@
         </w:tc>
         <w:tc>
           <w:tcPr>
-            <w:tcW w:w="1536" w:type="dxa"/>
+            <w:tcW w:w="1528" w:type="dxa"/>
           </w:tcPr>
           <w:p>
             <w:pPr>
@@ -394,7 +394,7 @@
         </w:tc>
         <w:tc>
           <w:tcPr>
-            <w:tcW w:w="1553" w:type="dxa"/>
+            <w:tcW w:w="1545" w:type="dxa"/>
           </w:tcPr>
           <w:p>
             <w:r>
@@ -405,7 +405,7 @@
         </w:tc>
         <w:tc>
           <w:tcPr>
-            <w:tcW w:w="1653" w:type="dxa"/>
+            <w:tcW w:w="1645" w:type="dxa"/>
           </w:tcPr>
           <w:p>
             <w:r>
@@ -431,7 +431,7 @@
         </w:tc>
         <w:tc>
           <w:tcPr>
-            <w:tcW w:w="1647" w:type="dxa"/>
+            <w:tcW w:w="1639" w:type="dxa"/>
           </w:tcPr>
           <w:p>
             <w:r>
@@ -451,7 +451,7 @@
         </w:tc>
         <w:tc>
           <w:tcPr>
-            <w:tcW w:w="1568" w:type="dxa"/>
+            <w:tcW w:w="1560" w:type="dxa"/>
           </w:tcPr>
           <w:p>
             <w:r>
@@ -468,7 +468,7 @@
       <w:tr>
         <w:tc>
           <w:tcPr>
-            <w:tcW w:w="1059" w:type="dxa"/>
+            <w:tcW w:w="1099" w:type="dxa"/>
           </w:tcPr>
           <w:p>
             <w:pPr>
@@ -497,7 +497,7 @@
         </w:tc>
         <w:tc>
           <w:tcPr>
-            <w:tcW w:w="1536" w:type="dxa"/>
+            <w:tcW w:w="1528" w:type="dxa"/>
           </w:tcPr>
           <w:p>
             <w:pPr>
@@ -517,7 +517,7 @@
         </w:tc>
         <w:tc>
           <w:tcPr>
-            <w:tcW w:w="1553" w:type="dxa"/>
+            <w:tcW w:w="1545" w:type="dxa"/>
           </w:tcPr>
           <w:p>
             <w:r>
@@ -535,7 +535,7 @@
         </w:tc>
         <w:tc>
           <w:tcPr>
-            <w:tcW w:w="1653" w:type="dxa"/>
+            <w:tcW w:w="1645" w:type="dxa"/>
           </w:tcPr>
           <w:p>
             <w:r>
@@ -545,7 +545,7 @@
         </w:tc>
         <w:tc>
           <w:tcPr>
-            <w:tcW w:w="1647" w:type="dxa"/>
+            <w:tcW w:w="1639" w:type="dxa"/>
           </w:tcPr>
           <w:p>
             <w:r>
@@ -555,7 +555,7 @@
         </w:tc>
         <w:tc>
           <w:tcPr>
-            <w:tcW w:w="1568" w:type="dxa"/>
+            <w:tcW w:w="1560" w:type="dxa"/>
           </w:tcPr>
           <w:p>
             <w:r>
@@ -567,7 +567,7 @@
       <w:tr>
         <w:tc>
           <w:tcPr>
-            <w:tcW w:w="1059" w:type="dxa"/>
+            <w:tcW w:w="1099" w:type="dxa"/>
           </w:tcPr>
           <w:p>
             <w:pPr>
@@ -587,7 +587,7 @@
         </w:tc>
         <w:tc>
           <w:tcPr>
-            <w:tcW w:w="1536" w:type="dxa"/>
+            <w:tcW w:w="1528" w:type="dxa"/>
           </w:tcPr>
           <w:p>
             <w:pPr>
@@ -609,13 +609,29 @@
                 <w:color w:val="000000"/>
               </w:rPr>
               <w:lastRenderedPageBreak/>
-              <w:t xml:space="preserve">using a MOSFiT model of hybrid 02es-like type Ia supernova to rule out the mechanisms of the explosion. </w:t>
-            </w:r>
-          </w:p>
-        </w:tc>
-        <w:tc>
-          <w:tcPr>
-            <w:tcW w:w="1553" w:type="dxa"/>
+              <w:t xml:space="preserve">using a </w:t>
+            </w:r>
+            <w:proofErr w:type="spellStart"/>
+            <w:r>
+              <w:rPr>
+                <w:rFonts w:ascii="Aptos Narrow" w:hAnsi="Aptos Narrow"/>
+                <w:color w:val="000000"/>
+              </w:rPr>
+              <w:t>MOSFiT</w:t>
+            </w:r>
+            <w:proofErr w:type="spellEnd"/>
+            <w:r>
+              <w:rPr>
+                <w:rFonts w:ascii="Aptos Narrow" w:hAnsi="Aptos Narrow"/>
+                <w:color w:val="000000"/>
+              </w:rPr>
+              <w:t xml:space="preserve"> model of hybrid 02es-like type Ia supernova to rule out the mechanisms of the explosion. </w:t>
+            </w:r>
+          </w:p>
+        </w:tc>
+        <w:tc>
+          <w:tcPr>
+            <w:tcW w:w="1545" w:type="dxa"/>
           </w:tcPr>
           <w:p>
             <w:r>
@@ -635,7 +651,7 @@
         </w:tc>
         <w:tc>
           <w:tcPr>
-            <w:tcW w:w="1653" w:type="dxa"/>
+            <w:tcW w:w="1645" w:type="dxa"/>
           </w:tcPr>
           <w:p>
             <w:r>
@@ -653,7 +669,7 @@
         </w:tc>
         <w:tc>
           <w:tcPr>
-            <w:tcW w:w="1647" w:type="dxa"/>
+            <w:tcW w:w="1639" w:type="dxa"/>
           </w:tcPr>
           <w:p>
             <w:r>
@@ -662,13 +678,21 @@
             </w:r>
             <w:r>
               <w:lastRenderedPageBreak/>
-              <w:t xml:space="preserve">limited the ability to place further constraints on the MOSFiT modelling to understand the cause of the circumstellar medium whether it was from tidal tails caused by WD merger event or disk originated matter caused by a disruption to the secondary white dwarf. </w:t>
-            </w:r>
-          </w:p>
-        </w:tc>
-        <w:tc>
-          <w:tcPr>
-            <w:tcW w:w="1568" w:type="dxa"/>
+              <w:t xml:space="preserve">limited the ability to place further constraints on the </w:t>
+            </w:r>
+            <w:proofErr w:type="spellStart"/>
+            <w:r>
+              <w:t>MOSFiT</w:t>
+            </w:r>
+            <w:proofErr w:type="spellEnd"/>
+            <w:r>
+              <w:t xml:space="preserve"> modelling to understand the cause of the circumstellar medium whether it was from tidal tails caused by WD merger event or disk originated matter caused by a disruption to the secondary white dwarf. </w:t>
+            </w:r>
+          </w:p>
+        </w:tc>
+        <w:tc>
+          <w:tcPr>
+            <w:tcW w:w="1560" w:type="dxa"/>
           </w:tcPr>
           <w:p>
             <w:r>
@@ -685,7 +709,7 @@
       <w:tr>
         <w:tc>
           <w:tcPr>
-            <w:tcW w:w="1059" w:type="dxa"/>
+            <w:tcW w:w="1099" w:type="dxa"/>
           </w:tcPr>
           <w:p>
             <w:pPr>
@@ -706,7 +730,7 @@
         </w:tc>
         <w:tc>
           <w:tcPr>
-            <w:tcW w:w="1536" w:type="dxa"/>
+            <w:tcW w:w="1528" w:type="dxa"/>
           </w:tcPr>
           <w:p>
             <w:pPr>
@@ -726,7 +750,7 @@
         </w:tc>
         <w:tc>
           <w:tcPr>
-            <w:tcW w:w="1553" w:type="dxa"/>
+            <w:tcW w:w="1545" w:type="dxa"/>
           </w:tcPr>
           <w:p>
             <w:r>
@@ -736,7 +760,7 @@
         </w:tc>
         <w:tc>
           <w:tcPr>
-            <w:tcW w:w="1653" w:type="dxa"/>
+            <w:tcW w:w="1645" w:type="dxa"/>
           </w:tcPr>
           <w:p>
             <w:r>
@@ -746,17 +770,25 @@
         </w:tc>
         <w:tc>
           <w:tcPr>
-            <w:tcW w:w="1647" w:type="dxa"/>
-          </w:tcPr>
-          <w:p>
-            <w:r>
-              <w:t>Limitations are I think in the classification of other transients as the other classes were broad brushed such as AGN-like and other_SN as well as how this will be effectively implemented into the retraining of the Fink Supernova classification module.</w:t>
-            </w:r>
-          </w:p>
-        </w:tc>
-        <w:tc>
-          <w:tcPr>
-            <w:tcW w:w="1568" w:type="dxa"/>
+            <w:tcW w:w="1639" w:type="dxa"/>
+          </w:tcPr>
+          <w:p>
+            <w:r>
+              <w:t xml:space="preserve">Limitations are I think in the classification of other transients as the other classes were broad brushed such as AGN-like and </w:t>
+            </w:r>
+            <w:proofErr w:type="spellStart"/>
+            <w:r>
+              <w:t>other_SN</w:t>
+            </w:r>
+            <w:proofErr w:type="spellEnd"/>
+            <w:r>
+              <w:t xml:space="preserve"> as well as how this will be effectively implemented into the retraining of the Fink Supernova classification module.</w:t>
+            </w:r>
+          </w:p>
+        </w:tc>
+        <w:tc>
+          <w:tcPr>
+            <w:tcW w:w="1560" w:type="dxa"/>
           </w:tcPr>
           <w:p>
             <w:r>
@@ -774,7 +806,7 @@
       <w:tr>
         <w:tc>
           <w:tcPr>
-            <w:tcW w:w="1059" w:type="dxa"/>
+            <w:tcW w:w="1099" w:type="dxa"/>
           </w:tcPr>
           <w:p>
             <w:pPr>
@@ -794,35 +826,35 @@
         </w:tc>
         <w:tc>
           <w:tcPr>
-            <w:tcW w:w="1536" w:type="dxa"/>
-          </w:tcPr>
-          <w:p>
-            <w:pPr>
-              <w:rPr>
-                <w:rFonts w:ascii="Aptos Narrow" w:hAnsi="Aptos Narrow"/>
-                <w:color w:val="000000"/>
-              </w:rPr>
-            </w:pPr>
-            <w:r>
-              <w:rPr>
-                <w:rFonts w:ascii="Aptos Narrow" w:hAnsi="Aptos Narrow"/>
-                <w:color w:val="000000"/>
-              </w:rPr>
-              <w:t xml:space="preserve">Using different bands flux data for 102 star forming  host galaxies </w:t>
-            </w:r>
-            <w:r>
-              <w:rPr>
-                <w:rFonts w:ascii="Aptos Narrow" w:hAnsi="Aptos Narrow"/>
-                <w:color w:val="000000"/>
-              </w:rPr>
-              <w:lastRenderedPageBreak/>
-              <w:t xml:space="preserve">to trace out what band types of supernovae are appearing in. This leads to the constraints that can be placed on the time delay distribution between when the explosion happens and what the progenitor was. </w:t>
-            </w:r>
-          </w:p>
-        </w:tc>
-        <w:tc>
-          <w:tcPr>
-            <w:tcW w:w="1553" w:type="dxa"/>
+            <w:tcW w:w="1528" w:type="dxa"/>
+          </w:tcPr>
+          <w:p>
+            <w:pPr>
+              <w:rPr>
+                <w:rFonts w:ascii="Aptos Narrow" w:hAnsi="Aptos Narrow"/>
+                <w:color w:val="000000"/>
+              </w:rPr>
+            </w:pPr>
+            <w:r>
+              <w:rPr>
+                <w:rFonts w:ascii="Aptos Narrow" w:hAnsi="Aptos Narrow"/>
+                <w:color w:val="000000"/>
+              </w:rPr>
+              <w:t xml:space="preserve">Using different bands flux data for 102 star forming  host galaxies to </w:t>
+            </w:r>
+            <w:r>
+              <w:rPr>
+                <w:rFonts w:ascii="Aptos Narrow" w:hAnsi="Aptos Narrow"/>
+                <w:color w:val="000000"/>
+              </w:rPr>
+              <w:lastRenderedPageBreak/>
+              <w:t xml:space="preserve">trace out what band types of supernovae are appearing in. This leads to the constraints that can be placed on the time delay distribution between when the explosion happens and what the progenitor was. </w:t>
+            </w:r>
+          </w:p>
+        </w:tc>
+        <w:tc>
+          <w:tcPr>
+            <w:tcW w:w="1545" w:type="dxa"/>
           </w:tcPr>
           <w:p>
             <w:r>
@@ -837,7 +869,7 @@
         </w:tc>
         <w:tc>
           <w:tcPr>
-            <w:tcW w:w="1653" w:type="dxa"/>
+            <w:tcW w:w="1645" w:type="dxa"/>
           </w:tcPr>
           <w:p>
             <w:r>
@@ -849,13 +881,21 @@
               <w:t xml:space="preserve">shows that </w:t>
             </w:r>
             <w:r>
-              <w:t>the progenitor of the SNe Ia cannot have a tiem delay of less than 100 Myr. Because otherwise you would see the supernovae fitting to the cumulative distribution in the H alpha and UV bands. But they did not fit to these bands.</w:t>
-            </w:r>
-          </w:p>
-        </w:tc>
-        <w:tc>
-          <w:tcPr>
-            <w:tcW w:w="1647" w:type="dxa"/>
+              <w:t xml:space="preserve">the progenitor of the SNe Ia cannot have a </w:t>
+            </w:r>
+            <w:proofErr w:type="spellStart"/>
+            <w:r>
+              <w:t>tiem</w:t>
+            </w:r>
+            <w:proofErr w:type="spellEnd"/>
+            <w:r>
+              <w:t xml:space="preserve"> delay of less than 100 Myr. Because otherwise you would see the supernovae fitting to the cumulative distribution in the H alpha and UV bands. But they did not fit to these bands.</w:t>
+            </w:r>
+          </w:p>
+        </w:tc>
+        <w:tc>
+          <w:tcPr>
+            <w:tcW w:w="1639" w:type="dxa"/>
           </w:tcPr>
           <w:p>
             <w:r>
@@ -870,7 +910,7 @@
         </w:tc>
         <w:tc>
           <w:tcPr>
-            <w:tcW w:w="1568" w:type="dxa"/>
+            <w:tcW w:w="1560" w:type="dxa"/>
           </w:tcPr>
           <w:p>
             <w:r>
@@ -880,6 +920,211 @@
             <w:r>
               <w:lastRenderedPageBreak/>
               <w:t>likely to be found in the blue bands of host galaxies, this will be crucial in developing the sample of SNe that I will search for Early Excess SNe in as these Early Execess SNe only occur in type Ias</w:t>
+            </w:r>
+          </w:p>
+        </w:tc>
+      </w:tr>
+      <w:tr>
+        <w:tc>
+          <w:tcPr>
+            <w:tcW w:w="1099" w:type="dxa"/>
+          </w:tcPr>
+          <w:p>
+            <w:pPr>
+              <w:rPr>
+                <w:rFonts w:ascii="Aptos Narrow" w:hAnsi="Aptos Narrow"/>
+                <w:color w:val="000000"/>
+              </w:rPr>
+            </w:pPr>
+            <w:r>
+              <w:rPr>
+                <w:rFonts w:ascii="Aptos Narrow" w:hAnsi="Aptos Narrow"/>
+                <w:color w:val="000000"/>
+              </w:rPr>
+              <w:lastRenderedPageBreak/>
+              <w:t>(</w:t>
+            </w:r>
+            <w:proofErr w:type="spellStart"/>
+            <w:r>
+              <w:rPr>
+                <w:rFonts w:ascii="Aptos Narrow" w:hAnsi="Aptos Narrow"/>
+                <w:color w:val="000000"/>
+              </w:rPr>
+              <w:t>Rigault</w:t>
+            </w:r>
+            <w:proofErr w:type="spellEnd"/>
+            <w:r>
+              <w:rPr>
+                <w:rFonts w:ascii="Aptos Narrow" w:hAnsi="Aptos Narrow"/>
+                <w:color w:val="000000"/>
+              </w:rPr>
+              <w:t xml:space="preserve"> et al., 2020)</w:t>
+            </w:r>
+          </w:p>
+          <w:p>
+            <w:pPr>
+              <w:rPr>
+                <w:rFonts w:ascii="Aptos Narrow" w:hAnsi="Aptos Narrow"/>
+                <w:color w:val="000000"/>
+              </w:rPr>
+            </w:pPr>
+          </w:p>
+        </w:tc>
+        <w:tc>
+          <w:tcPr>
+            <w:tcW w:w="1528" w:type="dxa"/>
+          </w:tcPr>
+          <w:p>
+            <w:pPr>
+              <w:rPr>
+                <w:rFonts w:ascii="Aptos Narrow" w:hAnsi="Aptos Narrow"/>
+                <w:color w:val="000000"/>
+              </w:rPr>
+            </w:pPr>
+            <w:r>
+              <w:rPr>
+                <w:rFonts w:ascii="Aptos Narrow" w:hAnsi="Aptos Narrow"/>
+                <w:color w:val="000000"/>
+              </w:rPr>
+              <w:t xml:space="preserve">To demonstrate how the local environment around a star and the age of the progenitor play a greater role in the standardisation of the brightness of the SNe. </w:t>
+            </w:r>
+          </w:p>
+        </w:tc>
+        <w:tc>
+          <w:tcPr>
+            <w:tcW w:w="1545" w:type="dxa"/>
+          </w:tcPr>
+          <w:p>
+            <w:r>
+              <w:t xml:space="preserve">Experimental: Using data from the SDSS and the nearby SN factory using 141 SNe Ia and then categorising the SNe by age and deriving the local specific star formation rate which is the new method used to probe the local environment of these supernovae. </w:t>
+            </w:r>
+          </w:p>
+        </w:tc>
+        <w:tc>
+          <w:tcPr>
+            <w:tcW w:w="1645" w:type="dxa"/>
+          </w:tcPr>
+          <w:p>
+            <w:r>
+              <w:t xml:space="preserve">The results show that fitting these SNe Ia on plots of colour, stretch and Hubble residuals as a function of the </w:t>
+            </w:r>
+            <w:proofErr w:type="spellStart"/>
+            <w:r>
+              <w:t>lsSFR</w:t>
+            </w:r>
+            <w:proofErr w:type="spellEnd"/>
+            <w:r>
+              <w:t xml:space="preserve"> shows a correlation with the stretch with a </w:t>
+            </w:r>
+            <w:proofErr w:type="spellStart"/>
+            <w:r>
+              <w:t>pearsons</w:t>
+            </w:r>
+            <w:proofErr w:type="spellEnd"/>
+            <w:r>
+              <w:t xml:space="preserve"> of -0.48 with a significance of 5 sigma, no correlation with colour and also finding that the mass step discrepancies appears when plotting Hubble residuals as a function of </w:t>
+            </w:r>
+            <w:proofErr w:type="spellStart"/>
+            <w:r>
+              <w:t>lsSFR</w:t>
+            </w:r>
+            <w:proofErr w:type="spellEnd"/>
+            <w:r>
+              <w:t xml:space="preserve">. Accounting for biases in the </w:t>
+            </w:r>
+            <w:proofErr w:type="spellStart"/>
+            <w:r>
+              <w:lastRenderedPageBreak/>
+              <w:t>lsSFR</w:t>
+            </w:r>
+            <w:proofErr w:type="spellEnd"/>
+            <w:r>
+              <w:t xml:space="preserve"> and </w:t>
+            </w:r>
+            <w:r>
+              <w:t xml:space="preserve">global stellar mass biases reduces the mass step by 70 per cent of its original value. Showing that the </w:t>
+            </w:r>
+            <w:proofErr w:type="spellStart"/>
+            <w:r>
+              <w:t>lsSFR</w:t>
+            </w:r>
+            <w:proofErr w:type="spellEnd"/>
+            <w:r>
+              <w:t xml:space="preserve"> which points to that this mass step is related to an intrinsic property of the SNe Ia and not something unrelated like the stellar mass of the Host.</w:t>
+            </w:r>
+          </w:p>
+        </w:tc>
+        <w:tc>
+          <w:tcPr>
+            <w:tcW w:w="1639" w:type="dxa"/>
+          </w:tcPr>
+          <w:p>
+            <w:r>
+              <w:lastRenderedPageBreak/>
+              <w:t xml:space="preserve">No ties to progenitors of the SNe Ia were mentioned and how the </w:t>
+            </w:r>
+            <w:proofErr w:type="spellStart"/>
+            <w:r>
+              <w:t>lsSFR</w:t>
+            </w:r>
+            <w:proofErr w:type="spellEnd"/>
+            <w:r>
+              <w:t xml:space="preserve"> could be used in that context, although this paper was determined to demonstrate the effectiveness of reducing the step in the Hubble residuals.</w:t>
+            </w:r>
+            <w:r>
+              <w:t xml:space="preserve"> </w:t>
+            </w:r>
+            <w:r>
+              <w:t>(</w:t>
+            </w:r>
+            <w:proofErr w:type="spellStart"/>
+            <w:r>
+              <w:t>Rigault</w:t>
+            </w:r>
+            <w:proofErr w:type="spellEnd"/>
+            <w:r>
+              <w:t xml:space="preserve"> et al., 2020)</w:t>
+            </w:r>
+            <w:r>
+              <w:t xml:space="preserve"> </w:t>
+            </w:r>
+            <w:proofErr w:type="spellStart"/>
+            <w:r>
+              <w:t>effecitvly</w:t>
+            </w:r>
+            <w:proofErr w:type="spellEnd"/>
+            <w:r>
+              <w:t xml:space="preserve"> establishes age as a physical driver that effects the observed mass step, but doesn’t touch on the physical </w:t>
+            </w:r>
+            <w:r>
+              <w:lastRenderedPageBreak/>
+              <w:t xml:space="preserve">explosion mechanisms or a physical interpretation. </w:t>
+            </w:r>
+          </w:p>
+        </w:tc>
+        <w:tc>
+          <w:tcPr>
+            <w:tcW w:w="1560" w:type="dxa"/>
+          </w:tcPr>
+          <w:p>
+            <w:r>
+              <w:lastRenderedPageBreak/>
+              <w:t xml:space="preserve">This paper cleared up the calibration process that occurs when analysing the light curve of SNe Ia and how calibration for Ia depends more on the intrinsic properties of the SN and less on the extrinsic properties. Hence the importance to understand the explosion mechanisms despite what the author of the paper suggests. </w:t>
+            </w:r>
+            <w:r>
+              <w:t xml:space="preserve">Specifically the use of </w:t>
+            </w:r>
+            <w:proofErr w:type="spellStart"/>
+            <w:r>
+              <w:t>lsSFR</w:t>
+            </w:r>
+            <w:proofErr w:type="spellEnd"/>
+            <w:r>
+              <w:t xml:space="preserve"> could </w:t>
+            </w:r>
+            <w:r>
+              <w:lastRenderedPageBreak/>
+              <w:t xml:space="preserve">be used to distinguish supernovae spatially in my research. </w:t>
             </w:r>
           </w:p>
         </w:tc>

</xml_diff>

<commit_message>
13/03/2026: Read Kelsey paper added summary of it in notebook, added entry into literature matrix, started writing a paragraph for literature review on gamma ray bursts in the intro hence new citations in the bibliography
</commit_message>
<xml_diff>
--- a/Literature_Matrix.docx
+++ b/Literature_Matrix.docx
@@ -9,17 +9,17 @@
         <w:tblLook w:val="04A0" w:firstRow="1" w:lastRow="0" w:firstColumn="1" w:lastColumn="0" w:noHBand="0" w:noVBand="1"/>
       </w:tblPr>
       <w:tblGrid>
-        <w:gridCol w:w="1095"/>
+        <w:gridCol w:w="1092"/>
+        <w:gridCol w:w="1559"/>
         <w:gridCol w:w="1549"/>
-        <w:gridCol w:w="1541"/>
-        <w:gridCol w:w="1640"/>
         <w:gridCol w:w="1635"/>
-        <w:gridCol w:w="1556"/>
+        <w:gridCol w:w="1630"/>
+        <w:gridCol w:w="1551"/>
       </w:tblGrid>
       <w:tr>
         <w:tc>
           <w:tcPr>
-            <w:tcW w:w="1099" w:type="dxa"/>
+            <w:tcW w:w="1095" w:type="dxa"/>
           </w:tcPr>
           <w:p>
             <w:pPr>
@@ -40,7 +40,7 @@
         </w:tc>
         <w:tc>
           <w:tcPr>
-            <w:tcW w:w="1528" w:type="dxa"/>
+            <w:tcW w:w="1549" w:type="dxa"/>
           </w:tcPr>
           <w:p>
             <w:pPr>
@@ -61,7 +61,7 @@
         </w:tc>
         <w:tc>
           <w:tcPr>
-            <w:tcW w:w="1545" w:type="dxa"/>
+            <w:tcW w:w="1541" w:type="dxa"/>
           </w:tcPr>
           <w:p>
             <w:pPr>
@@ -87,7 +87,7 @@
         </w:tc>
         <w:tc>
           <w:tcPr>
-            <w:tcW w:w="1645" w:type="dxa"/>
+            <w:tcW w:w="1640" w:type="dxa"/>
           </w:tcPr>
           <w:p>
             <w:pPr>
@@ -100,7 +100,7 @@
         </w:tc>
         <w:tc>
           <w:tcPr>
-            <w:tcW w:w="1639" w:type="dxa"/>
+            <w:tcW w:w="1635" w:type="dxa"/>
           </w:tcPr>
           <w:p>
             <w:pPr>
@@ -126,7 +126,7 @@
         </w:tc>
         <w:tc>
           <w:tcPr>
-            <w:tcW w:w="1560" w:type="dxa"/>
+            <w:tcW w:w="1556" w:type="dxa"/>
           </w:tcPr>
           <w:p>
             <w:pPr>
@@ -154,7 +154,7 @@
       <w:tr>
         <w:tc>
           <w:tcPr>
-            <w:tcW w:w="1099" w:type="dxa"/>
+            <w:tcW w:w="1095" w:type="dxa"/>
           </w:tcPr>
           <w:p>
             <w:pPr>
@@ -175,7 +175,7 @@
         </w:tc>
         <w:tc>
           <w:tcPr>
-            <w:tcW w:w="1528" w:type="dxa"/>
+            <w:tcW w:w="1549" w:type="dxa"/>
           </w:tcPr>
           <w:p>
             <w:pPr>
@@ -196,7 +196,7 @@
         </w:tc>
         <w:tc>
           <w:tcPr>
-            <w:tcW w:w="1545" w:type="dxa"/>
+            <w:tcW w:w="1541" w:type="dxa"/>
           </w:tcPr>
           <w:p>
             <w:r>
@@ -206,7 +206,7 @@
         </w:tc>
         <w:tc>
           <w:tcPr>
-            <w:tcW w:w="1645" w:type="dxa"/>
+            <w:tcW w:w="1640" w:type="dxa"/>
           </w:tcPr>
           <w:p>
             <w:r>
@@ -216,7 +216,7 @@
         </w:tc>
         <w:tc>
           <w:tcPr>
-            <w:tcW w:w="1639" w:type="dxa"/>
+            <w:tcW w:w="1635" w:type="dxa"/>
           </w:tcPr>
           <w:p>
             <w:r>
@@ -226,7 +226,7 @@
         </w:tc>
         <w:tc>
           <w:tcPr>
-            <w:tcW w:w="1560" w:type="dxa"/>
+            <w:tcW w:w="1556" w:type="dxa"/>
           </w:tcPr>
           <w:p>
             <w:r>
@@ -238,7 +238,7 @@
       <w:tr>
         <w:tc>
           <w:tcPr>
-            <w:tcW w:w="1099" w:type="dxa"/>
+            <w:tcW w:w="1095" w:type="dxa"/>
           </w:tcPr>
           <w:p>
             <w:pPr>
@@ -258,7 +258,7 @@
         </w:tc>
         <w:tc>
           <w:tcPr>
-            <w:tcW w:w="1528" w:type="dxa"/>
+            <w:tcW w:w="1549" w:type="dxa"/>
           </w:tcPr>
           <w:p>
             <w:pPr>
@@ -278,7 +278,7 @@
         </w:tc>
         <w:tc>
           <w:tcPr>
-            <w:tcW w:w="1545" w:type="dxa"/>
+            <w:tcW w:w="1541" w:type="dxa"/>
           </w:tcPr>
           <w:p>
             <w:r>
@@ -291,7 +291,7 @@
         </w:tc>
         <w:tc>
           <w:tcPr>
-            <w:tcW w:w="1645" w:type="dxa"/>
+            <w:tcW w:w="1640" w:type="dxa"/>
           </w:tcPr>
           <w:p>
             <w:r>
@@ -301,7 +301,7 @@
         </w:tc>
         <w:tc>
           <w:tcPr>
-            <w:tcW w:w="1639" w:type="dxa"/>
+            <w:tcW w:w="1635" w:type="dxa"/>
           </w:tcPr>
           <w:p>
             <w:r>
@@ -311,7 +311,7 @@
         </w:tc>
         <w:tc>
           <w:tcPr>
-            <w:tcW w:w="1560" w:type="dxa"/>
+            <w:tcW w:w="1556" w:type="dxa"/>
           </w:tcPr>
           <w:p>
             <w:r>
@@ -323,7 +323,7 @@
       <w:tr>
         <w:tc>
           <w:tcPr>
-            <w:tcW w:w="1099" w:type="dxa"/>
+            <w:tcW w:w="1095" w:type="dxa"/>
           </w:tcPr>
           <w:p>
             <w:pPr>
@@ -343,29 +343,29 @@
         </w:tc>
         <w:tc>
           <w:tcPr>
-            <w:tcW w:w="1528" w:type="dxa"/>
-          </w:tcPr>
-          <w:p>
-            <w:pPr>
-              <w:rPr>
-                <w:rFonts w:ascii="Aptos Narrow" w:hAnsi="Aptos Narrow"/>
-                <w:color w:val="000000"/>
-              </w:rPr>
-            </w:pPr>
-            <w:r>
-              <w:rPr>
-                <w:rFonts w:ascii="Aptos Narrow" w:hAnsi="Aptos Narrow"/>
-                <w:color w:val="000000"/>
-              </w:rPr>
-              <w:t>To fit light curves from 115 objects from the ZTF 2018 sample to a model grid that had various distributions of 56Ni shells with 67 % of them being explained as Chandrasekha</w:t>
-            </w:r>
-            <w:r>
-              <w:rPr>
-                <w:rFonts w:ascii="Aptos Narrow" w:hAnsi="Aptos Narrow"/>
-                <w:color w:val="000000"/>
-              </w:rPr>
-              <w:lastRenderedPageBreak/>
-              <w:t xml:space="preserve">r mass explosions. </w:t>
+            <w:tcW w:w="1549" w:type="dxa"/>
+          </w:tcPr>
+          <w:p>
+            <w:pPr>
+              <w:rPr>
+                <w:rFonts w:ascii="Aptos Narrow" w:hAnsi="Aptos Narrow"/>
+                <w:color w:val="000000"/>
+              </w:rPr>
+            </w:pPr>
+            <w:r>
+              <w:rPr>
+                <w:rFonts w:ascii="Aptos Narrow" w:hAnsi="Aptos Narrow"/>
+                <w:color w:val="000000"/>
+              </w:rPr>
+              <w:t xml:space="preserve">To fit light curves from 115 objects from the ZTF 2018 sample to a model grid that had various distributions of 56Ni shells with 67 % of them being explained as Chandrasekhar </w:t>
+            </w:r>
+            <w:r>
+              <w:rPr>
+                <w:rFonts w:ascii="Aptos Narrow" w:hAnsi="Aptos Narrow"/>
+                <w:color w:val="000000"/>
+              </w:rPr>
+              <w:lastRenderedPageBreak/>
+              <w:t xml:space="preserve">mass explosions. </w:t>
             </w:r>
           </w:p>
           <w:p>
@@ -394,7 +394,7 @@
         </w:tc>
         <w:tc>
           <w:tcPr>
-            <w:tcW w:w="1545" w:type="dxa"/>
+            <w:tcW w:w="1541" w:type="dxa"/>
           </w:tcPr>
           <w:p>
             <w:r>
@@ -405,7 +405,7 @@
         </w:tc>
         <w:tc>
           <w:tcPr>
-            <w:tcW w:w="1645" w:type="dxa"/>
+            <w:tcW w:w="1640" w:type="dxa"/>
           </w:tcPr>
           <w:p>
             <w:r>
@@ -431,7 +431,7 @@
         </w:tc>
         <w:tc>
           <w:tcPr>
-            <w:tcW w:w="1639" w:type="dxa"/>
+            <w:tcW w:w="1635" w:type="dxa"/>
           </w:tcPr>
           <w:p>
             <w:r>
@@ -451,7 +451,7 @@
         </w:tc>
         <w:tc>
           <w:tcPr>
-            <w:tcW w:w="1560" w:type="dxa"/>
+            <w:tcW w:w="1556" w:type="dxa"/>
           </w:tcPr>
           <w:p>
             <w:r>
@@ -468,7 +468,7 @@
       <w:tr>
         <w:tc>
           <w:tcPr>
-            <w:tcW w:w="1099" w:type="dxa"/>
+            <w:tcW w:w="1095" w:type="dxa"/>
           </w:tcPr>
           <w:p>
             <w:pPr>
@@ -497,7 +497,7 @@
         </w:tc>
         <w:tc>
           <w:tcPr>
-            <w:tcW w:w="1528" w:type="dxa"/>
+            <w:tcW w:w="1549" w:type="dxa"/>
           </w:tcPr>
           <w:p>
             <w:pPr>
@@ -517,7 +517,7 @@
         </w:tc>
         <w:tc>
           <w:tcPr>
-            <w:tcW w:w="1545" w:type="dxa"/>
+            <w:tcW w:w="1541" w:type="dxa"/>
           </w:tcPr>
           <w:p>
             <w:r>
@@ -535,7 +535,7 @@
         </w:tc>
         <w:tc>
           <w:tcPr>
-            <w:tcW w:w="1645" w:type="dxa"/>
+            <w:tcW w:w="1640" w:type="dxa"/>
           </w:tcPr>
           <w:p>
             <w:r>
@@ -545,7 +545,7 @@
         </w:tc>
         <w:tc>
           <w:tcPr>
-            <w:tcW w:w="1639" w:type="dxa"/>
+            <w:tcW w:w="1635" w:type="dxa"/>
           </w:tcPr>
           <w:p>
             <w:r>
@@ -555,7 +555,7 @@
         </w:tc>
         <w:tc>
           <w:tcPr>
-            <w:tcW w:w="1560" w:type="dxa"/>
+            <w:tcW w:w="1556" w:type="dxa"/>
           </w:tcPr>
           <w:p>
             <w:r>
@@ -567,7 +567,7 @@
       <w:tr>
         <w:tc>
           <w:tcPr>
-            <w:tcW w:w="1099" w:type="dxa"/>
+            <w:tcW w:w="1095" w:type="dxa"/>
           </w:tcPr>
           <w:p>
             <w:pPr>
@@ -587,29 +587,21 @@
         </w:tc>
         <w:tc>
           <w:tcPr>
-            <w:tcW w:w="1528" w:type="dxa"/>
-          </w:tcPr>
-          <w:p>
-            <w:pPr>
-              <w:rPr>
-                <w:rFonts w:ascii="Aptos Narrow" w:hAnsi="Aptos Narrow"/>
-                <w:color w:val="000000"/>
-              </w:rPr>
-            </w:pPr>
-            <w:r>
-              <w:rPr>
-                <w:rFonts w:ascii="Aptos Narrow" w:hAnsi="Aptos Narrow"/>
-                <w:color w:val="000000"/>
-              </w:rPr>
-              <w:t xml:space="preserve">Find appropriate constraints </w:t>
-            </w:r>
-            <w:r>
-              <w:rPr>
-                <w:rFonts w:ascii="Aptos Narrow" w:hAnsi="Aptos Narrow"/>
-                <w:color w:val="000000"/>
-              </w:rPr>
-              <w:lastRenderedPageBreak/>
-              <w:t xml:space="preserve">using a </w:t>
+            <w:tcW w:w="1549" w:type="dxa"/>
+          </w:tcPr>
+          <w:p>
+            <w:pPr>
+              <w:rPr>
+                <w:rFonts w:ascii="Aptos Narrow" w:hAnsi="Aptos Narrow"/>
+                <w:color w:val="000000"/>
+              </w:rPr>
+            </w:pPr>
+            <w:r>
+              <w:rPr>
+                <w:rFonts w:ascii="Aptos Narrow" w:hAnsi="Aptos Narrow"/>
+                <w:color w:val="000000"/>
+              </w:rPr>
+              <w:t xml:space="preserve">Find appropriate constraints using a </w:t>
             </w:r>
             <w:proofErr w:type="spellStart"/>
             <w:r>
@@ -625,13 +617,21 @@
                 <w:rFonts w:ascii="Aptos Narrow" w:hAnsi="Aptos Narrow"/>
                 <w:color w:val="000000"/>
               </w:rPr>
-              <w:t xml:space="preserve"> model of hybrid 02es-like type Ia supernova to rule out the mechanisms of the explosion. </w:t>
-            </w:r>
-          </w:p>
-        </w:tc>
-        <w:tc>
-          <w:tcPr>
-            <w:tcW w:w="1545" w:type="dxa"/>
+              <w:t xml:space="preserve"> </w:t>
+            </w:r>
+            <w:r>
+              <w:rPr>
+                <w:rFonts w:ascii="Aptos Narrow" w:hAnsi="Aptos Narrow"/>
+                <w:color w:val="000000"/>
+              </w:rPr>
+              <w:lastRenderedPageBreak/>
+              <w:t xml:space="preserve">model of hybrid 02es-like type Ia supernova to rule out the mechanisms of the explosion. </w:t>
+            </w:r>
+          </w:p>
+        </w:tc>
+        <w:tc>
+          <w:tcPr>
+            <w:tcW w:w="1541" w:type="dxa"/>
           </w:tcPr>
           <w:p>
             <w:r>
@@ -641,17 +641,17 @@
           </w:p>
           <w:p>
             <w:r>
-              <w:t xml:space="preserve">Using photometric </w:t>
-            </w:r>
-            <w:r>
-              <w:lastRenderedPageBreak/>
-              <w:t xml:space="preserve">and spectroscopic data fit to a model for transient objects to classify the constraints for these curves to occur. </w:t>
-            </w:r>
-          </w:p>
-        </w:tc>
-        <w:tc>
-          <w:tcPr>
-            <w:tcW w:w="1645" w:type="dxa"/>
+              <w:t xml:space="preserve">Using photometric and </w:t>
+            </w:r>
+            <w:r>
+              <w:lastRenderedPageBreak/>
+              <w:t xml:space="preserve">spectroscopic data fit to a model for transient objects to classify the constraints for these curves to occur. </w:t>
+            </w:r>
+          </w:p>
+        </w:tc>
+        <w:tc>
+          <w:tcPr>
+            <w:tcW w:w="1640" w:type="dxa"/>
           </w:tcPr>
           <w:p>
             <w:r>
@@ -659,26 +659,26 @@
               <w:t>(Srivastav et al., 2023)</w:t>
             </w:r>
             <w:r>
-              <w:t xml:space="preserve"> ruled out ejecta </w:t>
-            </w:r>
-            <w:r>
-              <w:lastRenderedPageBreak/>
-              <w:t xml:space="preserve">companion interaction, massive helium shell detonation and 56Ni distribution being drivers of the explosion and emphasised that the most reasonable explanation was the interaction of the SNe with the circumstellar medium. </w:t>
-            </w:r>
-          </w:p>
-        </w:tc>
-        <w:tc>
-          <w:tcPr>
-            <w:tcW w:w="1639" w:type="dxa"/>
-          </w:tcPr>
-          <w:p>
-            <w:r>
-              <w:lastRenderedPageBreak/>
-              <w:t xml:space="preserve">Limited access to follow up data </w:t>
-            </w:r>
-            <w:r>
-              <w:lastRenderedPageBreak/>
-              <w:t xml:space="preserve">limited the ability to place further constraints on the </w:t>
+              <w:t xml:space="preserve"> ruled out ejecta companion </w:t>
+            </w:r>
+            <w:r>
+              <w:lastRenderedPageBreak/>
+              <w:t xml:space="preserve">interaction, massive helium shell detonation and 56Ni distribution being drivers of the explosion and emphasised that the most reasonable explanation was the interaction of the SNe with the circumstellar medium. </w:t>
+            </w:r>
+          </w:p>
+        </w:tc>
+        <w:tc>
+          <w:tcPr>
+            <w:tcW w:w="1635" w:type="dxa"/>
+          </w:tcPr>
+          <w:p>
+            <w:r>
+              <w:lastRenderedPageBreak/>
+              <w:t xml:space="preserve">Limited access to follow up data limited the </w:t>
+            </w:r>
+            <w:r>
+              <w:lastRenderedPageBreak/>
+              <w:t xml:space="preserve">ability to place further constraints on the </w:t>
             </w:r>
             <w:proofErr w:type="spellStart"/>
             <w:r>
@@ -692,16 +692,16 @@
         </w:tc>
         <w:tc>
           <w:tcPr>
-            <w:tcW w:w="1560" w:type="dxa"/>
-          </w:tcPr>
-          <w:p>
-            <w:r>
-              <w:lastRenderedPageBreak/>
-              <w:t xml:space="preserve">As the scope of my project narrows I am </w:t>
-            </w:r>
-            <w:r>
-              <w:lastRenderedPageBreak/>
-              <w:t xml:space="preserve">looking for specific supernovae that are interesting to study, 02es types seem to have this early excess bump that I am interested in and this paper will help me in understanding the properties that lead to these early excess’s’. </w:t>
+            <w:tcW w:w="1556" w:type="dxa"/>
+          </w:tcPr>
+          <w:p>
+            <w:r>
+              <w:lastRenderedPageBreak/>
+              <w:t xml:space="preserve">As the scope of my project narrows I am looking for </w:t>
+            </w:r>
+            <w:r>
+              <w:lastRenderedPageBreak/>
+              <w:t xml:space="preserve">specific supernovae that are interesting to study, 02es types seem to have this early excess bump that I am interested in and this paper will help me in understanding the properties that lead to these early excess’s’. </w:t>
             </w:r>
           </w:p>
         </w:tc>
@@ -709,7 +709,7 @@
       <w:tr>
         <w:tc>
           <w:tcPr>
-            <w:tcW w:w="1099" w:type="dxa"/>
+            <w:tcW w:w="1095" w:type="dxa"/>
           </w:tcPr>
           <w:p>
             <w:pPr>
@@ -730,7 +730,7 @@
         </w:tc>
         <w:tc>
           <w:tcPr>
-            <w:tcW w:w="1528" w:type="dxa"/>
+            <w:tcW w:w="1549" w:type="dxa"/>
           </w:tcPr>
           <w:p>
             <w:pPr>
@@ -750,7 +750,7 @@
         </w:tc>
         <w:tc>
           <w:tcPr>
-            <w:tcW w:w="1545" w:type="dxa"/>
+            <w:tcW w:w="1541" w:type="dxa"/>
           </w:tcPr>
           <w:p>
             <w:r>
@@ -760,7 +760,7 @@
         </w:tc>
         <w:tc>
           <w:tcPr>
-            <w:tcW w:w="1645" w:type="dxa"/>
+            <w:tcW w:w="1640" w:type="dxa"/>
           </w:tcPr>
           <w:p>
             <w:r>
@@ -770,7 +770,7 @@
         </w:tc>
         <w:tc>
           <w:tcPr>
-            <w:tcW w:w="1639" w:type="dxa"/>
+            <w:tcW w:w="1635" w:type="dxa"/>
           </w:tcPr>
           <w:p>
             <w:r>
@@ -788,7 +788,7 @@
         </w:tc>
         <w:tc>
           <w:tcPr>
-            <w:tcW w:w="1560" w:type="dxa"/>
+            <w:tcW w:w="1556" w:type="dxa"/>
           </w:tcPr>
           <w:p>
             <w:r>
@@ -806,7 +806,7 @@
       <w:tr>
         <w:tc>
           <w:tcPr>
-            <w:tcW w:w="1099" w:type="dxa"/>
+            <w:tcW w:w="1095" w:type="dxa"/>
           </w:tcPr>
           <w:p>
             <w:pPr>
@@ -826,59 +826,59 @@
         </w:tc>
         <w:tc>
           <w:tcPr>
-            <w:tcW w:w="1528" w:type="dxa"/>
-          </w:tcPr>
-          <w:p>
-            <w:pPr>
-              <w:rPr>
-                <w:rFonts w:ascii="Aptos Narrow" w:hAnsi="Aptos Narrow"/>
-                <w:color w:val="000000"/>
-              </w:rPr>
-            </w:pPr>
-            <w:r>
-              <w:rPr>
-                <w:rFonts w:ascii="Aptos Narrow" w:hAnsi="Aptos Narrow"/>
-                <w:color w:val="000000"/>
-              </w:rPr>
-              <w:t xml:space="preserve">Using different bands flux data for 102 star forming  host galaxies to </w:t>
-            </w:r>
-            <w:r>
-              <w:rPr>
-                <w:rFonts w:ascii="Aptos Narrow" w:hAnsi="Aptos Narrow"/>
-                <w:color w:val="000000"/>
-              </w:rPr>
-              <w:lastRenderedPageBreak/>
-              <w:t xml:space="preserve">trace out what band types of supernovae are appearing in. This leads to the constraints that can be placed on the time delay distribution between when the explosion happens and what the progenitor was. </w:t>
-            </w:r>
-          </w:p>
-        </w:tc>
-        <w:tc>
-          <w:tcPr>
-            <w:tcW w:w="1545" w:type="dxa"/>
-          </w:tcPr>
-          <w:p>
-            <w:r>
-              <w:lastRenderedPageBreak/>
-              <w:t xml:space="preserve">Experimental: Fitting supernovas occurring in different </w:t>
-            </w:r>
-            <w:r>
-              <w:lastRenderedPageBreak/>
-              <w:t>bands of light from host galaxies using a pixel statistic NCR method. Host galaxies emit light from different parts of the galaxy so finding what band the supernovae are occurring in can find a spatial correlation with the host galaxy.</w:t>
-            </w:r>
-          </w:p>
-        </w:tc>
-        <w:tc>
-          <w:tcPr>
-            <w:tcW w:w="1645" w:type="dxa"/>
-          </w:tcPr>
-          <w:p>
-            <w:r>
-              <w:lastRenderedPageBreak/>
-              <w:t xml:space="preserve">That SNe Ia are occurring in the blue band of these host galaxies which </w:t>
-            </w:r>
-            <w:r>
-              <w:lastRenderedPageBreak/>
-              <w:t xml:space="preserve">shows that </w:t>
+            <w:tcW w:w="1549" w:type="dxa"/>
+          </w:tcPr>
+          <w:p>
+            <w:pPr>
+              <w:rPr>
+                <w:rFonts w:ascii="Aptos Narrow" w:hAnsi="Aptos Narrow"/>
+                <w:color w:val="000000"/>
+              </w:rPr>
+            </w:pPr>
+            <w:r>
+              <w:rPr>
+                <w:rFonts w:ascii="Aptos Narrow" w:hAnsi="Aptos Narrow"/>
+                <w:color w:val="000000"/>
+              </w:rPr>
+              <w:t xml:space="preserve">Using different bands flux data for 102 star forming  host galaxies to trace out what </w:t>
+            </w:r>
+            <w:r>
+              <w:rPr>
+                <w:rFonts w:ascii="Aptos Narrow" w:hAnsi="Aptos Narrow"/>
+                <w:color w:val="000000"/>
+              </w:rPr>
+              <w:lastRenderedPageBreak/>
+              <w:t xml:space="preserve">band types of supernovae are appearing in. This leads to the constraints that can be placed on the time delay distribution between when the explosion happens and what the progenitor was. </w:t>
+            </w:r>
+          </w:p>
+        </w:tc>
+        <w:tc>
+          <w:tcPr>
+            <w:tcW w:w="1541" w:type="dxa"/>
+          </w:tcPr>
+          <w:p>
+            <w:r>
+              <w:lastRenderedPageBreak/>
+              <w:t xml:space="preserve">Experimental: Fitting supernovas occurring in different bands of light </w:t>
+            </w:r>
+            <w:r>
+              <w:lastRenderedPageBreak/>
+              <w:t>from host galaxies using a pixel statistic NCR method. Host galaxies emit light from different parts of the galaxy so finding what band the supernovae are occurring in can find a spatial correlation with the host galaxy.</w:t>
+            </w:r>
+          </w:p>
+        </w:tc>
+        <w:tc>
+          <w:tcPr>
+            <w:tcW w:w="1640" w:type="dxa"/>
+          </w:tcPr>
+          <w:p>
+            <w:r>
+              <w:lastRenderedPageBreak/>
+              <w:t xml:space="preserve">That SNe Ia are occurring in the blue band of these host galaxies which shows </w:t>
+            </w:r>
+            <w:r>
+              <w:lastRenderedPageBreak/>
+              <w:t xml:space="preserve">that </w:t>
             </w:r>
             <w:r>
               <w:t xml:space="preserve">the progenitor of the SNe Ia cannot have a </w:t>
@@ -895,31 +895,31 @@
         </w:tc>
         <w:tc>
           <w:tcPr>
-            <w:tcW w:w="1639" w:type="dxa"/>
-          </w:tcPr>
-          <w:p>
-            <w:r>
-              <w:lastRenderedPageBreak/>
-              <w:t xml:space="preserve">No consideration of how dust affects results and limited </w:t>
-            </w:r>
-            <w:r>
-              <w:lastRenderedPageBreak/>
-              <w:t xml:space="preserve">conclusions on constraints placed on progenitor channels. </w:t>
-            </w:r>
-          </w:p>
-        </w:tc>
-        <w:tc>
-          <w:tcPr>
-            <w:tcW w:w="1560" w:type="dxa"/>
-          </w:tcPr>
-          <w:p>
-            <w:r>
-              <w:lastRenderedPageBreak/>
-              <w:t xml:space="preserve">This shows how the type of SN that I am searching for is more </w:t>
-            </w:r>
-            <w:r>
-              <w:lastRenderedPageBreak/>
-              <w:t>likely to be found in the blue bands of host galaxies, this will be crucial in developing the sample of SNe that I will search for Early Excess SNe in as these Early Execess SNe only occur in type Ias</w:t>
+            <w:tcW w:w="1635" w:type="dxa"/>
+          </w:tcPr>
+          <w:p>
+            <w:r>
+              <w:lastRenderedPageBreak/>
+              <w:t xml:space="preserve">No consideration of how dust affects results and limited conclusions </w:t>
+            </w:r>
+            <w:r>
+              <w:lastRenderedPageBreak/>
+              <w:t xml:space="preserve">on constraints placed on progenitor channels. </w:t>
+            </w:r>
+          </w:p>
+        </w:tc>
+        <w:tc>
+          <w:tcPr>
+            <w:tcW w:w="1556" w:type="dxa"/>
+          </w:tcPr>
+          <w:p>
+            <w:r>
+              <w:lastRenderedPageBreak/>
+              <w:t xml:space="preserve">This shows how the type of SN that I am searching for is more likely to be </w:t>
+            </w:r>
+            <w:r>
+              <w:lastRenderedPageBreak/>
+              <w:t>found in the blue bands of host galaxies, this will be crucial in developing the sample of SNe that I will search for Early Excess SNe in as these Early Execess SNe only occur in type Ias</w:t>
             </w:r>
           </w:p>
         </w:tc>
@@ -927,7 +927,7 @@
       <w:tr>
         <w:tc>
           <w:tcPr>
-            <w:tcW w:w="1099" w:type="dxa"/>
+            <w:tcW w:w="1095" w:type="dxa"/>
           </w:tcPr>
           <w:p>
             <w:pPr>
@@ -972,7 +972,7 @@
         </w:tc>
         <w:tc>
           <w:tcPr>
-            <w:tcW w:w="1528" w:type="dxa"/>
+            <w:tcW w:w="1549" w:type="dxa"/>
           </w:tcPr>
           <w:p>
             <w:pPr>
@@ -992,7 +992,7 @@
         </w:tc>
         <w:tc>
           <w:tcPr>
-            <w:tcW w:w="1545" w:type="dxa"/>
+            <w:tcW w:w="1541" w:type="dxa"/>
           </w:tcPr>
           <w:p>
             <w:r>
@@ -1002,7 +1002,7 @@
         </w:tc>
         <w:tc>
           <w:tcPr>
-            <w:tcW w:w="1645" w:type="dxa"/>
+            <w:tcW w:w="1640" w:type="dxa"/>
           </w:tcPr>
           <w:p>
             <w:r>
@@ -1034,7 +1034,6 @@
             </w:r>
             <w:proofErr w:type="spellStart"/>
             <w:r>
-              <w:lastRenderedPageBreak/>
               <w:t>lsSFR</w:t>
             </w:r>
             <w:proofErr w:type="spellEnd"/>
@@ -1042,6 +1041,7 @@
               <w:t xml:space="preserve"> and </w:t>
             </w:r>
             <w:r>
+              <w:lastRenderedPageBreak/>
               <w:t xml:space="preserve">global stellar mass biases reduces the mass step by 70 per cent of its original value. Showing that the </w:t>
             </w:r>
             <w:proofErr w:type="spellStart"/>
@@ -1056,7 +1056,7 @@
         </w:tc>
         <w:tc>
           <w:tcPr>
-            <w:tcW w:w="1639" w:type="dxa"/>
+            <w:tcW w:w="1635" w:type="dxa"/>
           </w:tcPr>
           <w:p>
             <w:r>
@@ -1094,17 +1094,17 @@
             </w:r>
             <w:proofErr w:type="spellEnd"/>
             <w:r>
-              <w:t xml:space="preserve"> establishes age as a physical driver that effects the observed mass step, but doesn’t touch on the physical </w:t>
-            </w:r>
-            <w:r>
-              <w:lastRenderedPageBreak/>
-              <w:t xml:space="preserve">explosion mechanisms or a physical interpretation. </w:t>
-            </w:r>
-          </w:p>
-        </w:tc>
-        <w:tc>
-          <w:tcPr>
-            <w:tcW w:w="1560" w:type="dxa"/>
+              <w:t xml:space="preserve"> establishes age as a physical driver that effects the observed mass step, but doesn’t touch on the physical explosion </w:t>
+            </w:r>
+            <w:r>
+              <w:lastRenderedPageBreak/>
+              <w:t xml:space="preserve">mechanisms or a physical interpretation. </w:t>
+            </w:r>
+          </w:p>
+        </w:tc>
+        <w:tc>
+          <w:tcPr>
+            <w:tcW w:w="1556" w:type="dxa"/>
           </w:tcPr>
           <w:p>
             <w:r>
@@ -1120,11 +1120,139 @@
             </w:r>
             <w:proofErr w:type="spellEnd"/>
             <w:r>
-              <w:t xml:space="preserve"> could </w:t>
-            </w:r>
-            <w:r>
-              <w:lastRenderedPageBreak/>
-              <w:t xml:space="preserve">be used to distinguish supernovae spatially in my research. </w:t>
+              <w:t xml:space="preserve"> could be used to </w:t>
+            </w:r>
+            <w:r>
+              <w:lastRenderedPageBreak/>
+              <w:t xml:space="preserve">distinguish supernovae spatially in my research. </w:t>
+            </w:r>
+          </w:p>
+        </w:tc>
+      </w:tr>
+      <w:tr>
+        <w:tc>
+          <w:tcPr>
+            <w:tcW w:w="1095" w:type="dxa"/>
+          </w:tcPr>
+          <w:p>
+            <w:pPr>
+              <w:rPr>
+                <w:rFonts w:ascii="Aptos Narrow" w:hAnsi="Aptos Narrow"/>
+                <w:color w:val="000000"/>
+              </w:rPr>
+            </w:pPr>
+            <w:r>
+              <w:rPr>
+                <w:rFonts w:ascii="Aptos Narrow" w:hAnsi="Aptos Narrow"/>
+                <w:color w:val="000000"/>
+              </w:rPr>
+              <w:lastRenderedPageBreak/>
+              <w:t> (Kelsey et al., 2022)</w:t>
+            </w:r>
+          </w:p>
+          <w:p>
+            <w:pPr>
+              <w:rPr>
+                <w:rFonts w:ascii="Aptos Narrow" w:hAnsi="Aptos Narrow"/>
+                <w:color w:val="000000"/>
+              </w:rPr>
+            </w:pPr>
+          </w:p>
+        </w:tc>
+        <w:tc>
+          <w:tcPr>
+            <w:tcW w:w="1549" w:type="dxa"/>
+          </w:tcPr>
+          <w:p>
+            <w:pPr>
+              <w:rPr>
+                <w:rFonts w:ascii="Aptos Narrow" w:hAnsi="Aptos Narrow"/>
+                <w:color w:val="000000"/>
+              </w:rPr>
+            </w:pPr>
+            <w:r>
+              <w:rPr>
+                <w:rFonts w:ascii="Aptos Narrow" w:hAnsi="Aptos Narrow"/>
+                <w:color w:val="000000"/>
+              </w:rPr>
+              <w:t xml:space="preserve">Does using the larger data set of 675 photometrically confirmed SNe Ia allow for further constraints placed on the mass step </w:t>
+            </w:r>
+            <w:proofErr w:type="spellStart"/>
+            <w:r>
+              <w:rPr>
+                <w:rFonts w:ascii="Aptos Narrow" w:hAnsi="Aptos Narrow"/>
+                <w:color w:val="000000"/>
+              </w:rPr>
+              <w:t>hubble</w:t>
+            </w:r>
+            <w:proofErr w:type="spellEnd"/>
+            <w:r>
+              <w:rPr>
+                <w:rFonts w:ascii="Aptos Narrow" w:hAnsi="Aptos Narrow"/>
+                <w:color w:val="000000"/>
+              </w:rPr>
+              <w:t xml:space="preserve"> residuals.</w:t>
+            </w:r>
+          </w:p>
+        </w:tc>
+        <w:tc>
+          <w:tcPr>
+            <w:tcW w:w="1541" w:type="dxa"/>
+          </w:tcPr>
+          <w:p>
+            <w:r>
+              <w:t>Experimental:</w:t>
+            </w:r>
+          </w:p>
+          <w:p>
+            <w:r>
+              <w:t xml:space="preserve">Using the SALT2 supernova model and the 675 SNe Ia obtained from the DES SN 5 year survey Kelsey et al obtained data and using an approximation of the dust extinction ratio </w:t>
+            </w:r>
+            <w:r>
+              <w:t>attempted to constrain the Hubble residual step</w:t>
+            </w:r>
+          </w:p>
+        </w:tc>
+        <w:tc>
+          <w:tcPr>
+            <w:tcW w:w="1640" w:type="dxa"/>
+          </w:tcPr>
+          <w:p>
+            <w:r>
+              <w:t xml:space="preserve">The key results are the homogeneity of the blue Sne Ia that double down and confirm previous findings and correlations with low mass higher SFR locally and blue portions of the galaxies exhibiting more uniform Luminosities. The other results is the reduction of the </w:t>
+            </w:r>
+            <w:proofErr w:type="spellStart"/>
+            <w:r>
+              <w:t>hubble</w:t>
+            </w:r>
+            <w:proofErr w:type="spellEnd"/>
+            <w:r>
+              <w:t xml:space="preserve"> residual step by fitting for colour dependent relations with the stellar masses and approximating for dust.</w:t>
+            </w:r>
+          </w:p>
+        </w:tc>
+        <w:tc>
+          <w:tcPr>
+            <w:tcW w:w="1635" w:type="dxa"/>
+          </w:tcPr>
+          <w:p>
+            <w:r>
+              <w:t xml:space="preserve">The main limitations of this study is the potential contamination of the sample with core collapse supernova which Kelsey discusses and demonstrates that the affect is both negligible by citing the overall contamination rate from the survey and the effects on the residuals when removing outliers. Kelsey et al definition of the local environment of 4 kpc radially is large </w:t>
+            </w:r>
+            <w:r>
+              <w:lastRenderedPageBreak/>
+              <w:t>and leaves the local definition vulnerable to contamination from sources that are not representative of the local environment of the object being studied.</w:t>
+            </w:r>
+          </w:p>
+        </w:tc>
+        <w:tc>
+          <w:tcPr>
+            <w:tcW w:w="1556" w:type="dxa"/>
+          </w:tcPr>
+          <w:p>
+            <w:r>
+              <w:lastRenderedPageBreak/>
+              <w:t xml:space="preserve">This further developed my understanding on how specific host galaxy properties are correlated to SNe Ia and how they are analysed. It also consolidated what I have learned so far and shows that the mass step doesn’t explain the dispersion and is consistent with other studies on how there is a broader homogeneity across colour despite host mass. </w:t>
             </w:r>
           </w:p>
         </w:tc>

</xml_diff>

<commit_message>
17/03/2026: New slides for a research skills class, created files for the skeletons of the presentation
</commit_message>
<xml_diff>
--- a/Literature_Matrix.docx
+++ b/Literature_Matrix.docx
@@ -419,7 +419,23 @@
           <w:p/>
           <w:p>
             <w:r>
-              <w:t xml:space="preserve">6 early flux excess SNe Ia are identified in the gr band data and they find with 18+-11 % </w:t>
+              <w:t xml:space="preserve">6 early </w:t>
+            </w:r>
+            <w:proofErr w:type="gramStart"/>
+            <w:r>
+              <w:t>flux</w:t>
+            </w:r>
+            <w:proofErr w:type="gramEnd"/>
+            <w:r>
+              <w:t xml:space="preserve"> excess SNe Ia are identified in the gr band </w:t>
+            </w:r>
+            <w:proofErr w:type="gramStart"/>
+            <w:r>
+              <w:t>data</w:t>
+            </w:r>
+            <w:proofErr w:type="gramEnd"/>
+            <w:r>
+              <w:t xml:space="preserve"> and they find with 18+-11 % </w:t>
             </w:r>
             <w:r>
               <w:t xml:space="preserve">of finding early flux excess SNe Ia at z &lt; 0.07 and a correlation with lower galaxy mass but this was not statistically significant due to a lack of data. </w:t>
@@ -549,7 +565,15 @@
           </w:tcPr>
           <w:p>
             <w:r>
-              <w:t xml:space="preserve">Small data issue seem to plague these studies as well as the methods used to determine the host galaxies of the SNe, although I didn’t read too deeply into methods. The paper specifically mentioned the relevance of the LSST using Rubin due to the large amounts of SNe that it’s expected to discover. </w:t>
+              <w:t xml:space="preserve">Small data issue </w:t>
+            </w:r>
+            <w:proofErr w:type="gramStart"/>
+            <w:r>
+              <w:t>seem</w:t>
+            </w:r>
+            <w:proofErr w:type="gramEnd"/>
+            <w:r>
+              <w:t xml:space="preserve"> to plague these studies as well as the methods used to determine the host galaxies of the SNe, although I didn’t read too deeply into methods. The paper specifically mentioned the relevance of the LSST using Rubin due to the large amounts of SNe that it’s expected to discover. </w:t>
             </w:r>
           </w:p>
         </w:tc>
@@ -1022,7 +1046,23 @@
             </w:r>
             <w:proofErr w:type="spellEnd"/>
             <w:r>
-              <w:t xml:space="preserve"> of -0.48 with a significance of 5 sigma, no correlation with colour and also finding that the mass step discrepancies appears when plotting Hubble residuals as a function of </w:t>
+              <w:t xml:space="preserve"> of -0.48 with a significance of 5 sigma, no correlation with colour </w:t>
+            </w:r>
+            <w:proofErr w:type="gramStart"/>
+            <w:r>
+              <w:t>and also</w:t>
+            </w:r>
+            <w:proofErr w:type="gramEnd"/>
+            <w:r>
+              <w:t xml:space="preserve"> finding that the mass step discrepancies </w:t>
+            </w:r>
+            <w:proofErr w:type="gramStart"/>
+            <w:r>
+              <w:t>appears</w:t>
+            </w:r>
+            <w:proofErr w:type="gramEnd"/>
+            <w:r>
+              <w:t xml:space="preserve"> when plotting Hubble residuals as a function of </w:t>
             </w:r>
             <w:proofErr w:type="spellStart"/>
             <w:r>
@@ -1094,7 +1134,15 @@
             </w:r>
             <w:proofErr w:type="spellEnd"/>
             <w:r>
-              <w:t xml:space="preserve"> establishes age as a physical driver that effects the observed mass step, but doesn’t touch on the physical explosion </w:t>
+              <w:t xml:space="preserve"> establishes age as a physical driver that effects the observed mass </w:t>
+            </w:r>
+            <w:proofErr w:type="gramStart"/>
+            <w:r>
+              <w:t>step, but</w:t>
+            </w:r>
+            <w:proofErr w:type="gramEnd"/>
+            <w:r>
+              <w:t xml:space="preserve"> doesn’t touch on the physical explosion </w:t>
             </w:r>
             <w:r>
               <w:lastRenderedPageBreak/>
@@ -1111,8 +1159,13 @@
               <w:lastRenderedPageBreak/>
               <w:t xml:space="preserve">This paper cleared up the calibration process that occurs when analysing the light curve of SNe Ia and how calibration for Ia depends more on the intrinsic properties of the SN and less on the extrinsic properties. Hence the importance to understand the explosion mechanisms despite what the author of the paper suggests. </w:t>
             </w:r>
-            <w:r>
-              <w:t xml:space="preserve">Specifically the use of </w:t>
+            <w:proofErr w:type="gramStart"/>
+            <w:r>
+              <w:t>Specifically</w:t>
+            </w:r>
+            <w:proofErr w:type="gramEnd"/>
+            <w:r>
+              <w:t xml:space="preserve"> the use of </w:t>
             </w:r>
             <w:proofErr w:type="spellStart"/>
             <w:r>
@@ -1206,7 +1259,15 @@
           </w:p>
           <w:p>
             <w:r>
-              <w:t xml:space="preserve">Using the SALT2 supernova model and the 675 SNe Ia obtained from the DES SN 5 year survey Kelsey et al obtained data and using an approximation of the dust extinction ratio </w:t>
+              <w:t xml:space="preserve">Using the SALT2 supernova model and the 675 SNe Ia obtained from the DES SN </w:t>
+            </w:r>
+            <w:proofErr w:type="gramStart"/>
+            <w:r>
+              <w:t>5 year</w:t>
+            </w:r>
+            <w:proofErr w:type="gramEnd"/>
+            <w:r>
+              <w:t xml:space="preserve"> survey Kelsey et al obtained data and using an approximation of the dust extinction ratio </w:t>
             </w:r>
             <w:r>
               <w:t>attempted to constrain the Hubble residual step</w:t>
@@ -1219,7 +1280,15 @@
           </w:tcPr>
           <w:p>
             <w:r>
-              <w:t xml:space="preserve">The key results are the homogeneity of the blue Sne Ia that double down and confirm previous findings and correlations with low mass higher SFR locally and blue portions of the galaxies exhibiting more uniform Luminosities. The other results is the reduction of the </w:t>
+              <w:t xml:space="preserve">The key results are the homogeneity of the blue Sne Ia that double down and confirm previous findings and correlations with low mass higher SFR locally and blue portions of the galaxies exhibiting more uniform Luminosities. The other results </w:t>
+            </w:r>
+            <w:proofErr w:type="gramStart"/>
+            <w:r>
+              <w:t>is</w:t>
+            </w:r>
+            <w:proofErr w:type="gramEnd"/>
+            <w:r>
+              <w:t xml:space="preserve"> the reduction of the </w:t>
             </w:r>
             <w:proofErr w:type="spellStart"/>
             <w:r>
@@ -1237,7 +1306,23 @@
           </w:tcPr>
           <w:p>
             <w:r>
-              <w:t xml:space="preserve">The main limitations of this study is the potential contamination of the sample with core collapse supernova which Kelsey discusses and demonstrates that the affect is both negligible by citing the overall contamination rate from the survey and the effects on the residuals when removing outliers. Kelsey et al definition of the local environment of 4 kpc radially is large </w:t>
+              <w:t xml:space="preserve">The main </w:t>
+            </w:r>
+            <w:proofErr w:type="gramStart"/>
+            <w:r>
+              <w:t>limitations</w:t>
+            </w:r>
+            <w:proofErr w:type="gramEnd"/>
+            <w:r>
+              <w:t xml:space="preserve"> of this study is the potential contamination of the sample with core collapse supernova which Kelsey discusses and demonstrates that the </w:t>
+            </w:r>
+            <w:proofErr w:type="gramStart"/>
+            <w:r>
+              <w:t>affect</w:t>
+            </w:r>
+            <w:proofErr w:type="gramEnd"/>
+            <w:r>
+              <w:t xml:space="preserve"> is both negligible by citing the overall contamination rate from the survey and the effects on the residuals when removing outliers. Kelsey et al definition of the local environment of 4 kpc radially is large </w:t>
             </w:r>
             <w:r>
               <w:lastRenderedPageBreak/>
@@ -1255,6 +1340,58 @@
               <w:t xml:space="preserve">This further developed my understanding on how specific host galaxy properties are correlated to SNe Ia and how they are analysed. It also consolidated what I have learned so far and shows that the mass step doesn’t explain the dispersion and is consistent with other studies on how there is a broader homogeneity across colour despite host mass. </w:t>
             </w:r>
           </w:p>
+        </w:tc>
+      </w:tr>
+      <w:tr>
+        <w:tc>
+          <w:tcPr>
+            <w:tcW w:w="1095" w:type="dxa"/>
+          </w:tcPr>
+          <w:p>
+            <w:pPr>
+              <w:rPr>
+                <w:rFonts w:ascii="Aptos Narrow" w:hAnsi="Aptos Narrow"/>
+                <w:color w:val="000000"/>
+              </w:rPr>
+            </w:pPr>
+          </w:p>
+        </w:tc>
+        <w:tc>
+          <w:tcPr>
+            <w:tcW w:w="1549" w:type="dxa"/>
+          </w:tcPr>
+          <w:p>
+            <w:pPr>
+              <w:rPr>
+                <w:rFonts w:ascii="Aptos Narrow" w:hAnsi="Aptos Narrow"/>
+                <w:color w:val="000000"/>
+              </w:rPr>
+            </w:pPr>
+          </w:p>
+        </w:tc>
+        <w:tc>
+          <w:tcPr>
+            <w:tcW w:w="1541" w:type="dxa"/>
+          </w:tcPr>
+          <w:p/>
+        </w:tc>
+        <w:tc>
+          <w:tcPr>
+            <w:tcW w:w="1640" w:type="dxa"/>
+          </w:tcPr>
+          <w:p/>
+        </w:tc>
+        <w:tc>
+          <w:tcPr>
+            <w:tcW w:w="1635" w:type="dxa"/>
+          </w:tcPr>
+          <w:p/>
+        </w:tc>
+        <w:tc>
+          <w:tcPr>
+            <w:tcW w:w="1556" w:type="dxa"/>
+          </w:tcPr>
+          <w:p/>
         </w:tc>
       </w:tr>
     </w:tbl>

</xml_diff>

<commit_message>
19/03/2026: New entry in literature review notebook for Pritchet et al., 2024 and entry in the literature matrix word doc as well
</commit_message>
<xml_diff>
--- a/Literature_Matrix.docx
+++ b/Literature_Matrix.docx
@@ -19,7 +19,7 @@
       <w:tr>
         <w:tc>
           <w:tcPr>
-            <w:tcW w:w="1095" w:type="dxa"/>
+            <w:tcW w:w="1092" w:type="dxa"/>
           </w:tcPr>
           <w:p>
             <w:pPr>
@@ -40,6 +40,27 @@
         </w:tc>
         <w:tc>
           <w:tcPr>
+            <w:tcW w:w="1559" w:type="dxa"/>
+          </w:tcPr>
+          <w:p>
+            <w:pPr>
+              <w:jc w:val="center"/>
+              <w:rPr>
+                <w:rFonts w:ascii="Aptos Narrow" w:hAnsi="Aptos Narrow"/>
+                <w:color w:val="000000"/>
+              </w:rPr>
+            </w:pPr>
+            <w:r>
+              <w:rPr>
+                <w:rFonts w:ascii="Aptos Narrow" w:hAnsi="Aptos Narrow"/>
+                <w:color w:val="000000"/>
+              </w:rPr>
+              <w:t>Research Question</w:t>
+            </w:r>
+          </w:p>
+        </w:tc>
+        <w:tc>
+          <w:tcPr>
             <w:tcW w:w="1549" w:type="dxa"/>
           </w:tcPr>
           <w:p>
@@ -55,78 +76,57 @@
                 <w:rFonts w:ascii="Aptos Narrow" w:hAnsi="Aptos Narrow"/>
                 <w:color w:val="000000"/>
               </w:rPr>
-              <w:t>Research Question</w:t>
-            </w:r>
-          </w:p>
-        </w:tc>
-        <w:tc>
-          <w:tcPr>
-            <w:tcW w:w="1541" w:type="dxa"/>
-          </w:tcPr>
+              <w:t>Methodology</w:t>
+            </w:r>
+          </w:p>
           <w:p>
             <w:pPr>
               <w:jc w:val="center"/>
-              <w:rPr>
-                <w:rFonts w:ascii="Aptos Narrow" w:hAnsi="Aptos Narrow"/>
-                <w:color w:val="000000"/>
-              </w:rPr>
-            </w:pPr>
-            <w:r>
-              <w:rPr>
-                <w:rFonts w:ascii="Aptos Narrow" w:hAnsi="Aptos Narrow"/>
-                <w:color w:val="000000"/>
-              </w:rPr>
-              <w:t>Methodology</w:t>
-            </w:r>
-          </w:p>
+            </w:pPr>
+          </w:p>
+        </w:tc>
+        <w:tc>
+          <w:tcPr>
+            <w:tcW w:w="1635" w:type="dxa"/>
+          </w:tcPr>
           <w:p>
             <w:pPr>
               <w:jc w:val="center"/>
             </w:pPr>
-          </w:p>
-        </w:tc>
-        <w:tc>
-          <w:tcPr>
-            <w:tcW w:w="1640" w:type="dxa"/>
+            <w:r>
+              <w:t>Key findings</w:t>
+            </w:r>
+          </w:p>
+        </w:tc>
+        <w:tc>
+          <w:tcPr>
+            <w:tcW w:w="1630" w:type="dxa"/>
           </w:tcPr>
           <w:p>
             <w:pPr>
               <w:jc w:val="center"/>
-            </w:pPr>
-            <w:r>
-              <w:t>Key findings</w:t>
-            </w:r>
-          </w:p>
-        </w:tc>
-        <w:tc>
-          <w:tcPr>
-            <w:tcW w:w="1635" w:type="dxa"/>
-          </w:tcPr>
+              <w:rPr>
+                <w:rFonts w:ascii="Aptos Narrow" w:hAnsi="Aptos Narrow"/>
+                <w:color w:val="000000"/>
+              </w:rPr>
+            </w:pPr>
+            <w:r>
+              <w:rPr>
+                <w:rFonts w:ascii="Aptos Narrow" w:hAnsi="Aptos Narrow"/>
+                <w:color w:val="000000"/>
+              </w:rPr>
+              <w:t>Gaps/limitations</w:t>
+            </w:r>
+          </w:p>
           <w:p>
             <w:pPr>
               <w:jc w:val="center"/>
-              <w:rPr>
-                <w:rFonts w:ascii="Aptos Narrow" w:hAnsi="Aptos Narrow"/>
-                <w:color w:val="000000"/>
-              </w:rPr>
-            </w:pPr>
-            <w:r>
-              <w:rPr>
-                <w:rFonts w:ascii="Aptos Narrow" w:hAnsi="Aptos Narrow"/>
-                <w:color w:val="000000"/>
-              </w:rPr>
-              <w:t>Gaps/limitations</w:t>
-            </w:r>
-          </w:p>
-          <w:p>
-            <w:pPr>
-              <w:jc w:val="center"/>
-            </w:pPr>
-          </w:p>
-        </w:tc>
-        <w:tc>
-          <w:tcPr>
-            <w:tcW w:w="1556" w:type="dxa"/>
+            </w:pPr>
+          </w:p>
+        </w:tc>
+        <w:tc>
+          <w:tcPr>
+            <w:tcW w:w="1551" w:type="dxa"/>
           </w:tcPr>
           <w:p>
             <w:pPr>
@@ -154,7 +154,7 @@
       <w:tr>
         <w:tc>
           <w:tcPr>
-            <w:tcW w:w="1095" w:type="dxa"/>
+            <w:tcW w:w="1092" w:type="dxa"/>
           </w:tcPr>
           <w:p>
             <w:pPr>
@@ -175,30 +175,30 @@
         </w:tc>
         <w:tc>
           <w:tcPr>
+            <w:tcW w:w="1559" w:type="dxa"/>
+          </w:tcPr>
+          <w:p>
+            <w:pPr>
+              <w:rPr>
+                <w:rFonts w:ascii="Aptos Narrow" w:hAnsi="Aptos Narrow"/>
+                <w:color w:val="000000"/>
+              </w:rPr>
+            </w:pPr>
+            <w:r>
+              <w:rPr>
+                <w:rFonts w:ascii="Aptos Narrow" w:hAnsi="Aptos Narrow"/>
+                <w:color w:val="000000"/>
+              </w:rPr>
+              <w:t>To determine the correlation between star formation rates and galaxy morphology</w:t>
+            </w:r>
+          </w:p>
+          <w:p/>
+        </w:tc>
+        <w:tc>
+          <w:tcPr>
             <w:tcW w:w="1549" w:type="dxa"/>
           </w:tcPr>
           <w:p>
-            <w:pPr>
-              <w:rPr>
-                <w:rFonts w:ascii="Aptos Narrow" w:hAnsi="Aptos Narrow"/>
-                <w:color w:val="000000"/>
-              </w:rPr>
-            </w:pPr>
-            <w:r>
-              <w:rPr>
-                <w:rFonts w:ascii="Aptos Narrow" w:hAnsi="Aptos Narrow"/>
-                <w:color w:val="000000"/>
-              </w:rPr>
-              <w:t>To determine the correlation between star formation rates and galaxy morphology</w:t>
-            </w:r>
-          </w:p>
-          <w:p/>
-        </w:tc>
-        <w:tc>
-          <w:tcPr>
-            <w:tcW w:w="1541" w:type="dxa"/>
-          </w:tcPr>
-          <w:p>
             <w:r>
               <w:t>Experimental: Data and used a quantitative analysis using star formation acceleration (SFA)</w:t>
             </w:r>
@@ -206,7 +206,7 @@
         </w:tc>
         <w:tc>
           <w:tcPr>
-            <w:tcW w:w="1640" w:type="dxa"/>
+            <w:tcW w:w="1635" w:type="dxa"/>
           </w:tcPr>
           <w:p>
             <w:r>
@@ -216,7 +216,7 @@
         </w:tc>
         <w:tc>
           <w:tcPr>
-            <w:tcW w:w="1635" w:type="dxa"/>
+            <w:tcW w:w="1630" w:type="dxa"/>
           </w:tcPr>
           <w:p>
             <w:r>
@@ -226,7 +226,7 @@
         </w:tc>
         <w:tc>
           <w:tcPr>
-            <w:tcW w:w="1556" w:type="dxa"/>
+            <w:tcW w:w="1551" w:type="dxa"/>
           </w:tcPr>
           <w:p>
             <w:r>
@@ -238,7 +238,7 @@
       <w:tr>
         <w:tc>
           <w:tcPr>
-            <w:tcW w:w="1095" w:type="dxa"/>
+            <w:tcW w:w="1092" w:type="dxa"/>
           </w:tcPr>
           <w:p>
             <w:pPr>
@@ -258,29 +258,29 @@
         </w:tc>
         <w:tc>
           <w:tcPr>
+            <w:tcW w:w="1559" w:type="dxa"/>
+          </w:tcPr>
+          <w:p>
+            <w:pPr>
+              <w:rPr>
+                <w:rFonts w:ascii="Aptos Narrow" w:hAnsi="Aptos Narrow"/>
+                <w:color w:val="000000"/>
+              </w:rPr>
+            </w:pPr>
+            <w:r>
+              <w:rPr>
+                <w:rFonts w:ascii="Aptos Narrow" w:hAnsi="Aptos Narrow"/>
+                <w:color w:val="000000"/>
+              </w:rPr>
+              <w:t>To develop a broker that can provide a steady access to ZTF and LSST data that has been pre-processed and classified, streamlining analysis.</w:t>
+            </w:r>
+          </w:p>
+        </w:tc>
+        <w:tc>
+          <w:tcPr>
             <w:tcW w:w="1549" w:type="dxa"/>
           </w:tcPr>
           <w:p>
-            <w:pPr>
-              <w:rPr>
-                <w:rFonts w:ascii="Aptos Narrow" w:hAnsi="Aptos Narrow"/>
-                <w:color w:val="000000"/>
-              </w:rPr>
-            </w:pPr>
-            <w:r>
-              <w:rPr>
-                <w:rFonts w:ascii="Aptos Narrow" w:hAnsi="Aptos Narrow"/>
-                <w:color w:val="000000"/>
-              </w:rPr>
-              <w:t>To develop a broker that can provide a steady access to ZTF and LSST data that has been pre-processed and classified, streamlining analysis.</w:t>
-            </w:r>
-          </w:p>
-        </w:tc>
-        <w:tc>
-          <w:tcPr>
-            <w:tcW w:w="1541" w:type="dxa"/>
-          </w:tcPr>
-          <w:p>
             <w:r>
               <w:t xml:space="preserve">Experimental: Data is ingested from telescope streams and stored on machine disks, </w:t>
             </w:r>
@@ -291,7 +291,7 @@
         </w:tc>
         <w:tc>
           <w:tcPr>
-            <w:tcW w:w="1640" w:type="dxa"/>
+            <w:tcW w:w="1635" w:type="dxa"/>
           </w:tcPr>
           <w:p>
             <w:r>
@@ -301,7 +301,7 @@
         </w:tc>
         <w:tc>
           <w:tcPr>
-            <w:tcW w:w="1635" w:type="dxa"/>
+            <w:tcW w:w="1630" w:type="dxa"/>
           </w:tcPr>
           <w:p>
             <w:r>
@@ -311,7 +311,7 @@
         </w:tc>
         <w:tc>
           <w:tcPr>
-            <w:tcW w:w="1556" w:type="dxa"/>
+            <w:tcW w:w="1551" w:type="dxa"/>
           </w:tcPr>
           <w:p>
             <w:r>
@@ -323,7 +323,7 @@
       <w:tr>
         <w:tc>
           <w:tcPr>
-            <w:tcW w:w="1095" w:type="dxa"/>
+            <w:tcW w:w="1092" w:type="dxa"/>
           </w:tcPr>
           <w:p>
             <w:pPr>
@@ -343,60 +343,60 @@
         </w:tc>
         <w:tc>
           <w:tcPr>
+            <w:tcW w:w="1559" w:type="dxa"/>
+          </w:tcPr>
+          <w:p>
+            <w:pPr>
+              <w:rPr>
+                <w:rFonts w:ascii="Aptos Narrow" w:hAnsi="Aptos Narrow"/>
+                <w:color w:val="000000"/>
+              </w:rPr>
+            </w:pPr>
+            <w:r>
+              <w:rPr>
+                <w:rFonts w:ascii="Aptos Narrow" w:hAnsi="Aptos Narrow"/>
+                <w:color w:val="000000"/>
+              </w:rPr>
+              <w:t xml:space="preserve">To fit light curves from 115 objects from the ZTF 2018 sample to a model grid that had various distributions of 56Ni shells with 67 % of them being explained as Chandrasekhar </w:t>
+            </w:r>
+            <w:r>
+              <w:rPr>
+                <w:rFonts w:ascii="Aptos Narrow" w:hAnsi="Aptos Narrow"/>
+                <w:color w:val="000000"/>
+              </w:rPr>
+              <w:lastRenderedPageBreak/>
+              <w:t xml:space="preserve">mass explosions. </w:t>
+            </w:r>
+          </w:p>
+          <w:p>
+            <w:pPr>
+              <w:rPr>
+                <w:rFonts w:ascii="Aptos Narrow" w:hAnsi="Aptos Narrow"/>
+                <w:color w:val="000000"/>
+              </w:rPr>
+            </w:pPr>
+          </w:p>
+          <w:p>
+            <w:pPr>
+              <w:rPr>
+                <w:rFonts w:ascii="Aptos Narrow" w:hAnsi="Aptos Narrow"/>
+                <w:color w:val="000000"/>
+              </w:rPr>
+            </w:pPr>
+            <w:r>
+              <w:rPr>
+                <w:rFonts w:ascii="Aptos Narrow" w:hAnsi="Aptos Narrow"/>
+                <w:color w:val="000000"/>
+              </w:rPr>
+              <w:t xml:space="preserve">Also attempted to explain the early excess fluxes appearing in 6 SNe  Ia by using the colours (g and r bands) and the lifetimes as explained by companion, CSM and 56Ni clump models.  </w:t>
+            </w:r>
+          </w:p>
+        </w:tc>
+        <w:tc>
+          <w:tcPr>
             <w:tcW w:w="1549" w:type="dxa"/>
           </w:tcPr>
           <w:p>
-            <w:pPr>
-              <w:rPr>
-                <w:rFonts w:ascii="Aptos Narrow" w:hAnsi="Aptos Narrow"/>
-                <w:color w:val="000000"/>
-              </w:rPr>
-            </w:pPr>
-            <w:r>
-              <w:rPr>
-                <w:rFonts w:ascii="Aptos Narrow" w:hAnsi="Aptos Narrow"/>
-                <w:color w:val="000000"/>
-              </w:rPr>
-              <w:t xml:space="preserve">To fit light curves from 115 objects from the ZTF 2018 sample to a model grid that had various distributions of 56Ni shells with 67 % of them being explained as Chandrasekhar </w:t>
-            </w:r>
-            <w:r>
-              <w:rPr>
-                <w:rFonts w:ascii="Aptos Narrow" w:hAnsi="Aptos Narrow"/>
-                <w:color w:val="000000"/>
-              </w:rPr>
-              <w:lastRenderedPageBreak/>
-              <w:t xml:space="preserve">mass explosions. </w:t>
-            </w:r>
-          </w:p>
-          <w:p>
-            <w:pPr>
-              <w:rPr>
-                <w:rFonts w:ascii="Aptos Narrow" w:hAnsi="Aptos Narrow"/>
-                <w:color w:val="000000"/>
-              </w:rPr>
-            </w:pPr>
-          </w:p>
-          <w:p>
-            <w:pPr>
-              <w:rPr>
-                <w:rFonts w:ascii="Aptos Narrow" w:hAnsi="Aptos Narrow"/>
-                <w:color w:val="000000"/>
-              </w:rPr>
-            </w:pPr>
-            <w:r>
-              <w:rPr>
-                <w:rFonts w:ascii="Aptos Narrow" w:hAnsi="Aptos Narrow"/>
-                <w:color w:val="000000"/>
-              </w:rPr>
-              <w:t xml:space="preserve">Also attempted to explain the early excess fluxes appearing in 6 SNe  Ia by using the colours (g and r bands) and the lifetimes as explained by companion, CSM and 56Ni clump models.  </w:t>
-            </w:r>
-          </w:p>
-        </w:tc>
-        <w:tc>
-          <w:tcPr>
-            <w:tcW w:w="1541" w:type="dxa"/>
-          </w:tcPr>
-          <w:p>
             <w:r>
               <w:lastRenderedPageBreak/>
               <w:t xml:space="preserve">Fitting experimental data from ZTF 2018 sample to the TURTLS model grid and attempting to constrain parameters to match light curves in the g and r band. </w:t>
@@ -405,7 +405,7 @@
         </w:tc>
         <w:tc>
           <w:tcPr>
-            <w:tcW w:w="1640" w:type="dxa"/>
+            <w:tcW w:w="1635" w:type="dxa"/>
           </w:tcPr>
           <w:p>
             <w:r>
@@ -447,7 +447,7 @@
         </w:tc>
         <w:tc>
           <w:tcPr>
-            <w:tcW w:w="1635" w:type="dxa"/>
+            <w:tcW w:w="1630" w:type="dxa"/>
           </w:tcPr>
           <w:p>
             <w:r>
@@ -467,7 +467,7 @@
         </w:tc>
         <w:tc>
           <w:tcPr>
-            <w:tcW w:w="1556" w:type="dxa"/>
+            <w:tcW w:w="1551" w:type="dxa"/>
           </w:tcPr>
           <w:p>
             <w:r>
@@ -484,7 +484,7 @@
       <w:tr>
         <w:tc>
           <w:tcPr>
-            <w:tcW w:w="1095" w:type="dxa"/>
+            <w:tcW w:w="1092" w:type="dxa"/>
           </w:tcPr>
           <w:p>
             <w:pPr>
@@ -513,29 +513,29 @@
         </w:tc>
         <w:tc>
           <w:tcPr>
+            <w:tcW w:w="1559" w:type="dxa"/>
+          </w:tcPr>
+          <w:p>
+            <w:pPr>
+              <w:rPr>
+                <w:rFonts w:ascii="Aptos Narrow" w:hAnsi="Aptos Narrow"/>
+                <w:color w:val="000000"/>
+              </w:rPr>
+            </w:pPr>
+            <w:r>
+              <w:rPr>
+                <w:rFonts w:ascii="Aptos Narrow" w:hAnsi="Aptos Narrow"/>
+                <w:color w:val="000000"/>
+              </w:rPr>
+              <w:t xml:space="preserve">Finding possible explanations to the colour – luminosity relation of SNe Ia with host galaxy properties. </w:t>
+            </w:r>
+          </w:p>
+        </w:tc>
+        <w:tc>
+          <w:tcPr>
             <w:tcW w:w="1549" w:type="dxa"/>
           </w:tcPr>
           <w:p>
-            <w:pPr>
-              <w:rPr>
-                <w:rFonts w:ascii="Aptos Narrow" w:hAnsi="Aptos Narrow"/>
-                <w:color w:val="000000"/>
-              </w:rPr>
-            </w:pPr>
-            <w:r>
-              <w:rPr>
-                <w:rFonts w:ascii="Aptos Narrow" w:hAnsi="Aptos Narrow"/>
-                <w:color w:val="000000"/>
-              </w:rPr>
-              <w:t xml:space="preserve">Finding possible explanations to the colour – luminosity relation of SNe Ia with host galaxy properties. </w:t>
-            </w:r>
-          </w:p>
-        </w:tc>
-        <w:tc>
-          <w:tcPr>
-            <w:tcW w:w="1541" w:type="dxa"/>
-          </w:tcPr>
-          <w:p>
             <w:r>
               <w:t>Experimental:</w:t>
             </w:r>
@@ -551,7 +551,7 @@
         </w:tc>
         <w:tc>
           <w:tcPr>
-            <w:tcW w:w="1640" w:type="dxa"/>
+            <w:tcW w:w="1635" w:type="dxa"/>
           </w:tcPr>
           <w:p>
             <w:r>
@@ -561,7 +561,7 @@
         </w:tc>
         <w:tc>
           <w:tcPr>
-            <w:tcW w:w="1635" w:type="dxa"/>
+            <w:tcW w:w="1630" w:type="dxa"/>
           </w:tcPr>
           <w:p>
             <w:r>
@@ -579,7 +579,7 @@
         </w:tc>
         <w:tc>
           <w:tcPr>
-            <w:tcW w:w="1556" w:type="dxa"/>
+            <w:tcW w:w="1551" w:type="dxa"/>
           </w:tcPr>
           <w:p>
             <w:r>
@@ -591,7 +591,7 @@
       <w:tr>
         <w:tc>
           <w:tcPr>
-            <w:tcW w:w="1095" w:type="dxa"/>
+            <w:tcW w:w="1092" w:type="dxa"/>
           </w:tcPr>
           <w:p>
             <w:pPr>
@@ -611,112 +611,112 @@
         </w:tc>
         <w:tc>
           <w:tcPr>
+            <w:tcW w:w="1559" w:type="dxa"/>
+          </w:tcPr>
+          <w:p>
+            <w:pPr>
+              <w:rPr>
+                <w:rFonts w:ascii="Aptos Narrow" w:hAnsi="Aptos Narrow"/>
+                <w:color w:val="000000"/>
+              </w:rPr>
+            </w:pPr>
+            <w:r>
+              <w:rPr>
+                <w:rFonts w:ascii="Aptos Narrow" w:hAnsi="Aptos Narrow"/>
+                <w:color w:val="000000"/>
+              </w:rPr>
+              <w:t xml:space="preserve">Find appropriate constraints using a </w:t>
+            </w:r>
+            <w:proofErr w:type="spellStart"/>
+            <w:r>
+              <w:rPr>
+                <w:rFonts w:ascii="Aptos Narrow" w:hAnsi="Aptos Narrow"/>
+                <w:color w:val="000000"/>
+              </w:rPr>
+              <w:t>MOSFiT</w:t>
+            </w:r>
+            <w:proofErr w:type="spellEnd"/>
+            <w:r>
+              <w:rPr>
+                <w:rFonts w:ascii="Aptos Narrow" w:hAnsi="Aptos Narrow"/>
+                <w:color w:val="000000"/>
+              </w:rPr>
+              <w:t xml:space="preserve"> </w:t>
+            </w:r>
+            <w:r>
+              <w:rPr>
+                <w:rFonts w:ascii="Aptos Narrow" w:hAnsi="Aptos Narrow"/>
+                <w:color w:val="000000"/>
+              </w:rPr>
+              <w:lastRenderedPageBreak/>
+              <w:t xml:space="preserve">model of hybrid 02es-like type Ia supernova to rule out the mechanisms of the explosion. </w:t>
+            </w:r>
+          </w:p>
+        </w:tc>
+        <w:tc>
+          <w:tcPr>
             <w:tcW w:w="1549" w:type="dxa"/>
           </w:tcPr>
           <w:p>
-            <w:pPr>
-              <w:rPr>
-                <w:rFonts w:ascii="Aptos Narrow" w:hAnsi="Aptos Narrow"/>
-                <w:color w:val="000000"/>
-              </w:rPr>
-            </w:pPr>
-            <w:r>
-              <w:rPr>
-                <w:rFonts w:ascii="Aptos Narrow" w:hAnsi="Aptos Narrow"/>
-                <w:color w:val="000000"/>
-              </w:rPr>
-              <w:t xml:space="preserve">Find appropriate constraints using a </w:t>
+            <w:r>
+              <w:lastRenderedPageBreak/>
+              <w:t>Experimental:</w:t>
+            </w:r>
+          </w:p>
+          <w:p>
+            <w:r>
+              <w:t xml:space="preserve">Using photometric and </w:t>
+            </w:r>
+            <w:r>
+              <w:lastRenderedPageBreak/>
+              <w:t xml:space="preserve">spectroscopic data fit to a model for transient objects to classify the constraints for these curves to occur. </w:t>
+            </w:r>
+          </w:p>
+        </w:tc>
+        <w:tc>
+          <w:tcPr>
+            <w:tcW w:w="1635" w:type="dxa"/>
+          </w:tcPr>
+          <w:p>
+            <w:r>
+              <w:lastRenderedPageBreak/>
+              <w:t>(Srivastav et al., 2023)</w:t>
+            </w:r>
+            <w:r>
+              <w:t xml:space="preserve"> ruled out ejecta companion </w:t>
+            </w:r>
+            <w:r>
+              <w:lastRenderedPageBreak/>
+              <w:t xml:space="preserve">interaction, massive helium shell detonation and 56Ni distribution being drivers of the explosion and emphasised that the most reasonable explanation was the interaction of the SNe with the circumstellar medium. </w:t>
+            </w:r>
+          </w:p>
+        </w:tc>
+        <w:tc>
+          <w:tcPr>
+            <w:tcW w:w="1630" w:type="dxa"/>
+          </w:tcPr>
+          <w:p>
+            <w:r>
+              <w:lastRenderedPageBreak/>
+              <w:t xml:space="preserve">Limited access to follow up data limited the </w:t>
+            </w:r>
+            <w:r>
+              <w:lastRenderedPageBreak/>
+              <w:t xml:space="preserve">ability to place further constraints on the </w:t>
             </w:r>
             <w:proofErr w:type="spellStart"/>
             <w:r>
-              <w:rPr>
-                <w:rFonts w:ascii="Aptos Narrow" w:hAnsi="Aptos Narrow"/>
-                <w:color w:val="000000"/>
-              </w:rPr>
               <w:t>MOSFiT</w:t>
             </w:r>
             <w:proofErr w:type="spellEnd"/>
             <w:r>
-              <w:rPr>
-                <w:rFonts w:ascii="Aptos Narrow" w:hAnsi="Aptos Narrow"/>
-                <w:color w:val="000000"/>
-              </w:rPr>
-              <w:t xml:space="preserve"> </w:t>
-            </w:r>
-            <w:r>
-              <w:rPr>
-                <w:rFonts w:ascii="Aptos Narrow" w:hAnsi="Aptos Narrow"/>
-                <w:color w:val="000000"/>
-              </w:rPr>
-              <w:lastRenderedPageBreak/>
-              <w:t xml:space="preserve">model of hybrid 02es-like type Ia supernova to rule out the mechanisms of the explosion. </w:t>
-            </w:r>
-          </w:p>
-        </w:tc>
-        <w:tc>
-          <w:tcPr>
-            <w:tcW w:w="1541" w:type="dxa"/>
-          </w:tcPr>
-          <w:p>
-            <w:r>
-              <w:lastRenderedPageBreak/>
-              <w:t>Experimental:</w:t>
-            </w:r>
-          </w:p>
-          <w:p>
-            <w:r>
-              <w:t xml:space="preserve">Using photometric and </w:t>
-            </w:r>
-            <w:r>
-              <w:lastRenderedPageBreak/>
-              <w:t xml:space="preserve">spectroscopic data fit to a model for transient objects to classify the constraints for these curves to occur. </w:t>
-            </w:r>
-          </w:p>
-        </w:tc>
-        <w:tc>
-          <w:tcPr>
-            <w:tcW w:w="1640" w:type="dxa"/>
-          </w:tcPr>
-          <w:p>
-            <w:r>
-              <w:lastRenderedPageBreak/>
-              <w:t>(Srivastav et al., 2023)</w:t>
-            </w:r>
-            <w:r>
-              <w:t xml:space="preserve"> ruled out ejecta companion </w:t>
-            </w:r>
-            <w:r>
-              <w:lastRenderedPageBreak/>
-              <w:t xml:space="preserve">interaction, massive helium shell detonation and 56Ni distribution being drivers of the explosion and emphasised that the most reasonable explanation was the interaction of the SNe with the circumstellar medium. </w:t>
-            </w:r>
-          </w:p>
-        </w:tc>
-        <w:tc>
-          <w:tcPr>
-            <w:tcW w:w="1635" w:type="dxa"/>
-          </w:tcPr>
-          <w:p>
-            <w:r>
-              <w:lastRenderedPageBreak/>
-              <w:t xml:space="preserve">Limited access to follow up data limited the </w:t>
-            </w:r>
-            <w:r>
-              <w:lastRenderedPageBreak/>
-              <w:t xml:space="preserve">ability to place further constraints on the </w:t>
-            </w:r>
-            <w:proofErr w:type="spellStart"/>
-            <w:r>
-              <w:t>MOSFiT</w:t>
-            </w:r>
-            <w:proofErr w:type="spellEnd"/>
-            <w:r>
               <w:t xml:space="preserve"> modelling to understand the cause of the circumstellar medium whether it was from tidal tails caused by WD merger event or disk originated matter caused by a disruption to the secondary white dwarf. </w:t>
             </w:r>
           </w:p>
         </w:tc>
         <w:tc>
           <w:tcPr>
-            <w:tcW w:w="1556" w:type="dxa"/>
+            <w:tcW w:w="1551" w:type="dxa"/>
           </w:tcPr>
           <w:p>
             <w:r>
@@ -733,7 +733,7 @@
       <w:tr>
         <w:tc>
           <w:tcPr>
-            <w:tcW w:w="1095" w:type="dxa"/>
+            <w:tcW w:w="1092" w:type="dxa"/>
           </w:tcPr>
           <w:p>
             <w:pPr>
@@ -754,29 +754,29 @@
         </w:tc>
         <w:tc>
           <w:tcPr>
+            <w:tcW w:w="1559" w:type="dxa"/>
+          </w:tcPr>
+          <w:p>
+            <w:pPr>
+              <w:rPr>
+                <w:rFonts w:ascii="Aptos Narrow" w:hAnsi="Aptos Narrow"/>
+                <w:color w:val="000000"/>
+              </w:rPr>
+            </w:pPr>
+            <w:r>
+              <w:rPr>
+                <w:rFonts w:ascii="Aptos Narrow" w:hAnsi="Aptos Narrow"/>
+                <w:color w:val="000000"/>
+              </w:rPr>
+              <w:t xml:space="preserve">To demonstrate how an active learning loop can be an effective method to sample a new training dataset for a classification model given small validation data. </w:t>
+            </w:r>
+          </w:p>
+        </w:tc>
+        <w:tc>
+          <w:tcPr>
             <w:tcW w:w="1549" w:type="dxa"/>
           </w:tcPr>
           <w:p>
-            <w:pPr>
-              <w:rPr>
-                <w:rFonts w:ascii="Aptos Narrow" w:hAnsi="Aptos Narrow"/>
-                <w:color w:val="000000"/>
-              </w:rPr>
-            </w:pPr>
-            <w:r>
-              <w:rPr>
-                <w:rFonts w:ascii="Aptos Narrow" w:hAnsi="Aptos Narrow"/>
-                <w:color w:val="000000"/>
-              </w:rPr>
-              <w:t xml:space="preserve">To demonstrate how an active learning loop can be an effective method to sample a new training dataset for a classification model given small validation data. </w:t>
-            </w:r>
-          </w:p>
-        </w:tc>
-        <w:tc>
-          <w:tcPr>
-            <w:tcW w:w="1541" w:type="dxa"/>
-          </w:tcPr>
-          <w:p>
             <w:r>
               <w:t xml:space="preserve">A pipeline of filtering, feature extraction and then classification to create the sample that the true model will be retrained on. </w:t>
             </w:r>
@@ -784,7 +784,7 @@
         </w:tc>
         <w:tc>
           <w:tcPr>
-            <w:tcW w:w="1640" w:type="dxa"/>
+            <w:tcW w:w="1635" w:type="dxa"/>
           </w:tcPr>
           <w:p>
             <w:r>
@@ -794,7 +794,7 @@
         </w:tc>
         <w:tc>
           <w:tcPr>
-            <w:tcW w:w="1635" w:type="dxa"/>
+            <w:tcW w:w="1630" w:type="dxa"/>
           </w:tcPr>
           <w:p>
             <w:r>
@@ -812,7 +812,7 @@
         </w:tc>
         <w:tc>
           <w:tcPr>
-            <w:tcW w:w="1556" w:type="dxa"/>
+            <w:tcW w:w="1551" w:type="dxa"/>
           </w:tcPr>
           <w:p>
             <w:r>
@@ -830,7 +830,7 @@
       <w:tr>
         <w:tc>
           <w:tcPr>
-            <w:tcW w:w="1095" w:type="dxa"/>
+            <w:tcW w:w="1092" w:type="dxa"/>
           </w:tcPr>
           <w:p>
             <w:pPr>
@@ -850,37 +850,37 @@
         </w:tc>
         <w:tc>
           <w:tcPr>
+            <w:tcW w:w="1559" w:type="dxa"/>
+          </w:tcPr>
+          <w:p>
+            <w:pPr>
+              <w:rPr>
+                <w:rFonts w:ascii="Aptos Narrow" w:hAnsi="Aptos Narrow"/>
+                <w:color w:val="000000"/>
+              </w:rPr>
+            </w:pPr>
+            <w:r>
+              <w:rPr>
+                <w:rFonts w:ascii="Aptos Narrow" w:hAnsi="Aptos Narrow"/>
+                <w:color w:val="000000"/>
+              </w:rPr>
+              <w:t xml:space="preserve">Using different bands flux data for 102 star forming  host galaxies to trace out what </w:t>
+            </w:r>
+            <w:r>
+              <w:rPr>
+                <w:rFonts w:ascii="Aptos Narrow" w:hAnsi="Aptos Narrow"/>
+                <w:color w:val="000000"/>
+              </w:rPr>
+              <w:lastRenderedPageBreak/>
+              <w:t xml:space="preserve">band types of supernovae are appearing in. This leads to the constraints that can be placed on the time delay distribution between when the explosion happens and what the progenitor was. </w:t>
+            </w:r>
+          </w:p>
+        </w:tc>
+        <w:tc>
+          <w:tcPr>
             <w:tcW w:w="1549" w:type="dxa"/>
           </w:tcPr>
           <w:p>
-            <w:pPr>
-              <w:rPr>
-                <w:rFonts w:ascii="Aptos Narrow" w:hAnsi="Aptos Narrow"/>
-                <w:color w:val="000000"/>
-              </w:rPr>
-            </w:pPr>
-            <w:r>
-              <w:rPr>
-                <w:rFonts w:ascii="Aptos Narrow" w:hAnsi="Aptos Narrow"/>
-                <w:color w:val="000000"/>
-              </w:rPr>
-              <w:t xml:space="preserve">Using different bands flux data for 102 star forming  host galaxies to trace out what </w:t>
-            </w:r>
-            <w:r>
-              <w:rPr>
-                <w:rFonts w:ascii="Aptos Narrow" w:hAnsi="Aptos Narrow"/>
-                <w:color w:val="000000"/>
-              </w:rPr>
-              <w:lastRenderedPageBreak/>
-              <w:t xml:space="preserve">band types of supernovae are appearing in. This leads to the constraints that can be placed on the time delay distribution between when the explosion happens and what the progenitor was. </w:t>
-            </w:r>
-          </w:p>
-        </w:tc>
-        <w:tc>
-          <w:tcPr>
-            <w:tcW w:w="1541" w:type="dxa"/>
-          </w:tcPr>
-          <w:p>
             <w:r>
               <w:lastRenderedPageBreak/>
               <w:t xml:space="preserve">Experimental: Fitting supernovas occurring in different bands of light </w:t>
@@ -893,7 +893,7 @@
         </w:tc>
         <w:tc>
           <w:tcPr>
-            <w:tcW w:w="1640" w:type="dxa"/>
+            <w:tcW w:w="1635" w:type="dxa"/>
           </w:tcPr>
           <w:p>
             <w:r>
@@ -919,7 +919,7 @@
         </w:tc>
         <w:tc>
           <w:tcPr>
-            <w:tcW w:w="1635" w:type="dxa"/>
+            <w:tcW w:w="1630" w:type="dxa"/>
           </w:tcPr>
           <w:p>
             <w:r>
@@ -934,7 +934,7 @@
         </w:tc>
         <w:tc>
           <w:tcPr>
-            <w:tcW w:w="1556" w:type="dxa"/>
+            <w:tcW w:w="1551" w:type="dxa"/>
           </w:tcPr>
           <w:p>
             <w:r>
@@ -951,7 +951,7 @@
       <w:tr>
         <w:tc>
           <w:tcPr>
-            <w:tcW w:w="1095" w:type="dxa"/>
+            <w:tcW w:w="1092" w:type="dxa"/>
           </w:tcPr>
           <w:p>
             <w:pPr>
@@ -996,29 +996,29 @@
         </w:tc>
         <w:tc>
           <w:tcPr>
+            <w:tcW w:w="1559" w:type="dxa"/>
+          </w:tcPr>
+          <w:p>
+            <w:pPr>
+              <w:rPr>
+                <w:rFonts w:ascii="Aptos Narrow" w:hAnsi="Aptos Narrow"/>
+                <w:color w:val="000000"/>
+              </w:rPr>
+            </w:pPr>
+            <w:r>
+              <w:rPr>
+                <w:rFonts w:ascii="Aptos Narrow" w:hAnsi="Aptos Narrow"/>
+                <w:color w:val="000000"/>
+              </w:rPr>
+              <w:t xml:space="preserve">To demonstrate how the local environment around a star and the age of the progenitor play a greater role in the standardisation of the brightness of the SNe. </w:t>
+            </w:r>
+          </w:p>
+        </w:tc>
+        <w:tc>
+          <w:tcPr>
             <w:tcW w:w="1549" w:type="dxa"/>
           </w:tcPr>
           <w:p>
-            <w:pPr>
-              <w:rPr>
-                <w:rFonts w:ascii="Aptos Narrow" w:hAnsi="Aptos Narrow"/>
-                <w:color w:val="000000"/>
-              </w:rPr>
-            </w:pPr>
-            <w:r>
-              <w:rPr>
-                <w:rFonts w:ascii="Aptos Narrow" w:hAnsi="Aptos Narrow"/>
-                <w:color w:val="000000"/>
-              </w:rPr>
-              <w:t xml:space="preserve">To demonstrate how the local environment around a star and the age of the progenitor play a greater role in the standardisation of the brightness of the SNe. </w:t>
-            </w:r>
-          </w:p>
-        </w:tc>
-        <w:tc>
-          <w:tcPr>
-            <w:tcW w:w="1541" w:type="dxa"/>
-          </w:tcPr>
-          <w:p>
             <w:r>
               <w:t xml:space="preserve">Experimental: Using data from the SDSS and the nearby SN factory using 141 SNe Ia and then categorising the SNe by age and deriving the local specific star formation rate which is the new method used to probe the local environment of these supernovae. </w:t>
             </w:r>
@@ -1026,7 +1026,7 @@
         </w:tc>
         <w:tc>
           <w:tcPr>
-            <w:tcW w:w="1640" w:type="dxa"/>
+            <w:tcW w:w="1635" w:type="dxa"/>
           </w:tcPr>
           <w:p>
             <w:r>
@@ -1096,7 +1096,7 @@
         </w:tc>
         <w:tc>
           <w:tcPr>
-            <w:tcW w:w="1635" w:type="dxa"/>
+            <w:tcW w:w="1630" w:type="dxa"/>
           </w:tcPr>
           <w:p>
             <w:r>
@@ -1152,7 +1152,7 @@
         </w:tc>
         <w:tc>
           <w:tcPr>
-            <w:tcW w:w="1556" w:type="dxa"/>
+            <w:tcW w:w="1551" w:type="dxa"/>
           </w:tcPr>
           <w:p>
             <w:r>
@@ -1185,7 +1185,7 @@
       <w:tr>
         <w:tc>
           <w:tcPr>
-            <w:tcW w:w="1095" w:type="dxa"/>
+            <w:tcW w:w="1092" w:type="dxa"/>
           </w:tcPr>
           <w:p>
             <w:pPr>
@@ -1214,114 +1214,114 @@
         </w:tc>
         <w:tc>
           <w:tcPr>
+            <w:tcW w:w="1559" w:type="dxa"/>
+          </w:tcPr>
+          <w:p>
+            <w:pPr>
+              <w:rPr>
+                <w:rFonts w:ascii="Aptos Narrow" w:hAnsi="Aptos Narrow"/>
+                <w:color w:val="000000"/>
+              </w:rPr>
+            </w:pPr>
+            <w:r>
+              <w:rPr>
+                <w:rFonts w:ascii="Aptos Narrow" w:hAnsi="Aptos Narrow"/>
+                <w:color w:val="000000"/>
+              </w:rPr>
+              <w:t xml:space="preserve">Does using the larger data set of 675 photometrically confirmed SNe Ia allow for further constraints placed on the mass step </w:t>
+            </w:r>
+            <w:proofErr w:type="spellStart"/>
+            <w:r>
+              <w:rPr>
+                <w:rFonts w:ascii="Aptos Narrow" w:hAnsi="Aptos Narrow"/>
+                <w:color w:val="000000"/>
+              </w:rPr>
+              <w:t>hubble</w:t>
+            </w:r>
+            <w:proofErr w:type="spellEnd"/>
+            <w:r>
+              <w:rPr>
+                <w:rFonts w:ascii="Aptos Narrow" w:hAnsi="Aptos Narrow"/>
+                <w:color w:val="000000"/>
+              </w:rPr>
+              <w:t xml:space="preserve"> residuals.</w:t>
+            </w:r>
+          </w:p>
+        </w:tc>
+        <w:tc>
+          <w:tcPr>
             <w:tcW w:w="1549" w:type="dxa"/>
           </w:tcPr>
           <w:p>
-            <w:pPr>
-              <w:rPr>
-                <w:rFonts w:ascii="Aptos Narrow" w:hAnsi="Aptos Narrow"/>
-                <w:color w:val="000000"/>
-              </w:rPr>
-            </w:pPr>
-            <w:r>
-              <w:rPr>
-                <w:rFonts w:ascii="Aptos Narrow" w:hAnsi="Aptos Narrow"/>
-                <w:color w:val="000000"/>
-              </w:rPr>
-              <w:t xml:space="preserve">Does using the larger data set of 675 photometrically confirmed SNe Ia allow for further constraints placed on the mass step </w:t>
+            <w:r>
+              <w:t>Experimental:</w:t>
+            </w:r>
+          </w:p>
+          <w:p>
+            <w:r>
+              <w:t xml:space="preserve">Using the SALT2 supernova model and the 675 SNe Ia obtained from the DES SN </w:t>
+            </w:r>
+            <w:proofErr w:type="gramStart"/>
+            <w:r>
+              <w:t>5 year</w:t>
+            </w:r>
+            <w:proofErr w:type="gramEnd"/>
+            <w:r>
+              <w:t xml:space="preserve"> survey Kelsey et al obtained data and using an approximation of the dust extinction ratio </w:t>
+            </w:r>
+            <w:r>
+              <w:t>attempted to constrain the Hubble residual step</w:t>
+            </w:r>
+          </w:p>
+        </w:tc>
+        <w:tc>
+          <w:tcPr>
+            <w:tcW w:w="1635" w:type="dxa"/>
+          </w:tcPr>
+          <w:p>
+            <w:r>
+              <w:t xml:space="preserve">The key results are the homogeneity of the blue Sne Ia that double down and confirm previous findings and correlations with low mass higher SFR locally and blue portions of the galaxies exhibiting more uniform Luminosities. The other results </w:t>
+            </w:r>
+            <w:proofErr w:type="gramStart"/>
+            <w:r>
+              <w:t>is</w:t>
+            </w:r>
+            <w:proofErr w:type="gramEnd"/>
+            <w:r>
+              <w:t xml:space="preserve"> the reduction of the </w:t>
             </w:r>
             <w:proofErr w:type="spellStart"/>
             <w:r>
-              <w:rPr>
-                <w:rFonts w:ascii="Aptos Narrow" w:hAnsi="Aptos Narrow"/>
-                <w:color w:val="000000"/>
-              </w:rPr>
               <w:t>hubble</w:t>
             </w:r>
             <w:proofErr w:type="spellEnd"/>
             <w:r>
-              <w:rPr>
-                <w:rFonts w:ascii="Aptos Narrow" w:hAnsi="Aptos Narrow"/>
-                <w:color w:val="000000"/>
-              </w:rPr>
-              <w:t xml:space="preserve"> residuals.</w:t>
-            </w:r>
-          </w:p>
-        </w:tc>
-        <w:tc>
-          <w:tcPr>
-            <w:tcW w:w="1541" w:type="dxa"/>
-          </w:tcPr>
-          <w:p>
-            <w:r>
-              <w:t>Experimental:</w:t>
-            </w:r>
-          </w:p>
-          <w:p>
-            <w:r>
-              <w:t xml:space="preserve">Using the SALT2 supernova model and the 675 SNe Ia obtained from the DES SN </w:t>
+              <w:t xml:space="preserve"> residual step by fitting for colour dependent relations with the stellar masses and approximating for dust.</w:t>
+            </w:r>
+          </w:p>
+        </w:tc>
+        <w:tc>
+          <w:tcPr>
+            <w:tcW w:w="1630" w:type="dxa"/>
+          </w:tcPr>
+          <w:p>
+            <w:r>
+              <w:t xml:space="preserve">The main </w:t>
             </w:r>
             <w:proofErr w:type="gramStart"/>
             <w:r>
-              <w:t>5 year</w:t>
+              <w:t>limitations</w:t>
             </w:r>
             <w:proofErr w:type="gramEnd"/>
             <w:r>
-              <w:t xml:space="preserve"> survey Kelsey et al obtained data and using an approximation of the dust extinction ratio </w:t>
-            </w:r>
-            <w:r>
-              <w:t>attempted to constrain the Hubble residual step</w:t>
-            </w:r>
-          </w:p>
-        </w:tc>
-        <w:tc>
-          <w:tcPr>
-            <w:tcW w:w="1640" w:type="dxa"/>
-          </w:tcPr>
-          <w:p>
-            <w:r>
-              <w:t xml:space="preserve">The key results are the homogeneity of the blue Sne Ia that double down and confirm previous findings and correlations with low mass higher SFR locally and blue portions of the galaxies exhibiting more uniform Luminosities. The other results </w:t>
+              <w:t xml:space="preserve"> of this study is the potential contamination of the sample with core collapse supernova which Kelsey discusses and demonstrates that the </w:t>
             </w:r>
             <w:proofErr w:type="gramStart"/>
             <w:r>
-              <w:t>is</w:t>
+              <w:t>affect</w:t>
             </w:r>
             <w:proofErr w:type="gramEnd"/>
             <w:r>
-              <w:t xml:space="preserve"> the reduction of the </w:t>
-            </w:r>
-            <w:proofErr w:type="spellStart"/>
-            <w:r>
-              <w:t>hubble</w:t>
-            </w:r>
-            <w:proofErr w:type="spellEnd"/>
-            <w:r>
-              <w:t xml:space="preserve"> residual step by fitting for colour dependent relations with the stellar masses and approximating for dust.</w:t>
-            </w:r>
-          </w:p>
-        </w:tc>
-        <w:tc>
-          <w:tcPr>
-            <w:tcW w:w="1635" w:type="dxa"/>
-          </w:tcPr>
-          <w:p>
-            <w:r>
-              <w:t xml:space="preserve">The main </w:t>
-            </w:r>
-            <w:proofErr w:type="gramStart"/>
-            <w:r>
-              <w:t>limitations</w:t>
-            </w:r>
-            <w:proofErr w:type="gramEnd"/>
-            <w:r>
-              <w:t xml:space="preserve"> of this study is the potential contamination of the sample with core collapse supernova which Kelsey discusses and demonstrates that the </w:t>
-            </w:r>
-            <w:proofErr w:type="gramStart"/>
-            <w:r>
-              <w:t>affect</w:t>
-            </w:r>
-            <w:proofErr w:type="gramEnd"/>
-            <w:r>
               <w:t xml:space="preserve"> is both negligible by citing the overall contamination rate from the survey and the effects on the residuals when removing outliers. Kelsey et al definition of the local environment of 4 kpc radially is large </w:t>
             </w:r>
             <w:r>
@@ -1332,7 +1332,7 @@
         </w:tc>
         <w:tc>
           <w:tcPr>
-            <w:tcW w:w="1556" w:type="dxa"/>
+            <w:tcW w:w="1551" w:type="dxa"/>
           </w:tcPr>
           <w:p>
             <w:r>
@@ -1345,15 +1345,50 @@
       <w:tr>
         <w:tc>
           <w:tcPr>
-            <w:tcW w:w="1095" w:type="dxa"/>
-          </w:tcPr>
-          <w:p>
-            <w:pPr>
-              <w:rPr>
-                <w:rFonts w:ascii="Aptos Narrow" w:hAnsi="Aptos Narrow"/>
-                <w:color w:val="000000"/>
-              </w:rPr>
-            </w:pPr>
+            <w:tcW w:w="1092" w:type="dxa"/>
+          </w:tcPr>
+          <w:p>
+            <w:pPr>
+              <w:rPr>
+                <w:rFonts w:ascii="Aptos Narrow" w:hAnsi="Aptos Narrow"/>
+                <w:color w:val="000000"/>
+              </w:rPr>
+            </w:pPr>
+            <w:r>
+              <w:rPr>
+                <w:rFonts w:ascii="Aptos Narrow" w:hAnsi="Aptos Narrow"/>
+                <w:color w:val="000000"/>
+              </w:rPr>
+              <w:t>(Pritchet et al., 2024)</w:t>
+            </w:r>
+          </w:p>
+          <w:p>
+            <w:pPr>
+              <w:rPr>
+                <w:rFonts w:ascii="Aptos Narrow" w:hAnsi="Aptos Narrow"/>
+                <w:color w:val="000000"/>
+              </w:rPr>
+            </w:pPr>
+          </w:p>
+        </w:tc>
+        <w:tc>
+          <w:tcPr>
+            <w:tcW w:w="1559" w:type="dxa"/>
+          </w:tcPr>
+          <w:p>
+            <w:pPr>
+              <w:rPr>
+                <w:rFonts w:ascii="Aptos Narrow" w:hAnsi="Aptos Narrow"/>
+                <w:color w:val="000000"/>
+              </w:rPr>
+            </w:pPr>
+            <w:r>
+              <w:rPr>
+                <w:rFonts w:ascii="Aptos Narrow" w:hAnsi="Aptos Narrow"/>
+                <w:color w:val="000000"/>
+              </w:rPr>
+              <w:t>To investigate the correlation between the spatial distribution of type Ia Supernovas in their host galaxies.</w:t>
+            </w:r>
           </w:p>
         </w:tc>
         <w:tc>
@@ -1361,37 +1396,69 @@
             <w:tcW w:w="1549" w:type="dxa"/>
           </w:tcPr>
           <w:p>
-            <w:pPr>
-              <w:rPr>
-                <w:rFonts w:ascii="Aptos Narrow" w:hAnsi="Aptos Narrow"/>
-                <w:color w:val="000000"/>
-              </w:rPr>
-            </w:pPr>
-          </w:p>
-        </w:tc>
-        <w:tc>
-          <w:tcPr>
-            <w:tcW w:w="1541" w:type="dxa"/>
-          </w:tcPr>
-          <w:p/>
-        </w:tc>
-        <w:tc>
-          <w:tcPr>
-            <w:tcW w:w="1640" w:type="dxa"/>
-          </w:tcPr>
-          <w:p/>
+            <w:r>
+              <w:t>Experimental:</w:t>
+            </w:r>
+          </w:p>
+          <w:p>
+            <w:r>
+              <w:t xml:space="preserve">Used 1947 SNe Ia from the SDSS to fit the ratio of light from the supernovae and the light from the galaxy to see how the supernovae luminosity traced out the luminosity of the galaxy using </w:t>
+            </w:r>
+            <w:proofErr w:type="spellStart"/>
+            <w:r>
+              <w:t>isophotes</w:t>
+            </w:r>
+            <w:proofErr w:type="spellEnd"/>
+            <w:r>
+              <w:t>.</w:t>
+            </w:r>
+          </w:p>
         </w:tc>
         <w:tc>
           <w:tcPr>
             <w:tcW w:w="1635" w:type="dxa"/>
           </w:tcPr>
-          <w:p/>
-        </w:tc>
-        <w:tc>
-          <w:tcPr>
-            <w:tcW w:w="1556" w:type="dxa"/>
-          </w:tcPr>
-          <w:p/>
+          <w:p>
+            <w:r>
+              <w:t xml:space="preserve">From the 1947 supernovae it was found that those in galaxies where the light was dominated by the disc traced the luminosity ratio of the </w:t>
+            </w:r>
+            <w:proofErr w:type="spellStart"/>
+            <w:r>
+              <w:t>isophotes</w:t>
+            </w:r>
+            <w:proofErr w:type="spellEnd"/>
+            <w:r>
+              <w:t xml:space="preserve"> compared to the luminosity of the whole aperture of the host galaxy. This was found to be the case for SNe Ia for the bulge as </w:t>
+            </w:r>
+            <w:proofErr w:type="gramStart"/>
+            <w:r>
+              <w:t>well</w:t>
+            </w:r>
+            <w:proofErr w:type="gramEnd"/>
+            <w:r>
+              <w:t xml:space="preserve"> but the conclusion is weaker due to the poorer resolution of data of SNe Ia around the bulge of host galaxies. </w:t>
+            </w:r>
+          </w:p>
+        </w:tc>
+        <w:tc>
+          <w:tcPr>
+            <w:tcW w:w="1630" w:type="dxa"/>
+          </w:tcPr>
+          <w:p>
+            <w:r>
+              <w:t xml:space="preserve">The main limitation was the study on how the SNe Ia traced out the light from the bulges of the host galaxies, as the poorer resolution of host galaxies where the light is bulge dominated led it to be more difficult to detect SNe Ia in those parts which leads to difficult to say conclusions around the distribution of SNe Ia in hosts dominated by bulge light. </w:t>
+            </w:r>
+          </w:p>
+        </w:tc>
+        <w:tc>
+          <w:tcPr>
+            <w:tcW w:w="1551" w:type="dxa"/>
+          </w:tcPr>
+          <w:p>
+            <w:r>
+              <w:t>This paper again helps build context on the search to narrow down progenitor channels of SNe Ia by showing that because SNe Ia trace out the light in the discs of the host galaxies it shows that the delay time detonation relation is more likely 1/t thus turning towards younger populations having more supernovae. I am investigating early excess fluxes to attempt to make further constraints on progenitor channels on SNe Ia.</w:t>
+            </w:r>
+          </w:p>
         </w:tc>
       </w:tr>
     </w:tbl>
@@ -2009,6 +2076,7 @@
   <w:style w:type="character" w:default="1" w:styleId="DefaultParagraphFont">
     <w:name w:val="Default Paragraph Font"/>
     <w:uiPriority w:val="1"/>
+    <w:semiHidden/>
     <w:unhideWhenUsed/>
   </w:style>
   <w:style w:type="table" w:default="1" w:styleId="TableNormal">

</xml_diff>